<commit_message>
Revise proposal per judge-panel round 1: exec summary restructure, SOM math shown, data-flow reorder, legality scope, diagram legibility
Co-Authored-By: Claude Fable 5 <noreply@anthropic.com>
Claude-Session: https://claude.ai/code/session_01BRbN1conQ6WbT1TXRrNhHs
</commit_message>
<xml_diff>
--- a/hacksphere-2026/proposal/ROOT ACCESS-TANDATANI-INTL.docx
+++ b/hacksphere-2026/proposal/ROOT ACCESS-TANDATANI-INTL.docx
@@ -1629,6 +1629,458 @@
     </w:p>
     <w:p>
       <w:pPr>
+        <w:spacing w:after="110" w:before="0" w:line="276" w:lineRule="auto"/>
+        <w:ind w:left="720" w:firstLine="0"/>
+        <w:jc w:val="left"/>
+        <w:rPr>
+          <w:rFonts w:ascii="Times New Roman" w:cs="Times New Roman" w:eastAsia="Times New Roman" w:hAnsi="Times New Roman"/>
+          <w:sz w:val="22"/>
+          <w:szCs w:val="22"/>
+        </w:rPr>
+      </w:pPr>
+      <w:r>
+        <w:rPr>
+          <w:rFonts w:ascii="Times New Roman" w:cs="Times New Roman" w:eastAsia="Times New Roman" w:hAnsi="Times New Roman"/>
+          <w:sz w:val="22"/>
+          <w:szCs w:val="22"/>
+          <w:b w:val="1"/>
+          <w:rtl w:val="0"/>
+        </w:rPr>
+        <w:t xml:space="preserve">TANDATANI</w:t>
+      </w:r>
+      <w:r>
+        <w:rPr>
+          <w:rFonts w:ascii="Times New Roman" w:cs="Times New Roman" w:eastAsia="Times New Roman" w:hAnsi="Times New Roman"/>
+          <w:sz w:val="22"/>
+          <w:szCs w:val="22"/>
+          <w:rtl w:val="0"/>
+        </w:rPr>
+        <w:t xml:space="preserve"> (from Bahasa Indonesia </w:t>
+      </w:r>
+      <w:r>
+        <w:rPr>
+          <w:rFonts w:ascii="Times New Roman" w:cs="Times New Roman" w:eastAsia="Times New Roman" w:hAnsi="Times New Roman"/>
+          <w:sz w:val="22"/>
+          <w:szCs w:val="22"/>
+          <w:i w:val="1"/>
+          <w:rtl w:val="0"/>
+        </w:rPr>
+        <w:t xml:space="preserve">tanda</w:t>
+      </w:r>
+      <w:r>
+        <w:rPr>
+          <w:rFonts w:ascii="Times New Roman" w:cs="Times New Roman" w:eastAsia="Times New Roman" w:hAnsi="Times New Roman"/>
+          <w:sz w:val="22"/>
+          <w:szCs w:val="22"/>
+          <w:rtl w:val="0"/>
+        </w:rPr>
+        <w:t xml:space="preserve"> “mark” + </w:t>
+      </w:r>
+      <w:r>
+        <w:rPr>
+          <w:rFonts w:ascii="Times New Roman" w:cs="Times New Roman" w:eastAsia="Times New Roman" w:hAnsi="Times New Roman"/>
+          <w:sz w:val="22"/>
+          <w:szCs w:val="22"/>
+          <w:i w:val="1"/>
+          <w:rtl w:val="0"/>
+        </w:rPr>
+        <w:t xml:space="preserve">tani</w:t>
+      </w:r>
+      <w:r>
+        <w:rPr>
+          <w:rFonts w:ascii="Times New Roman" w:cs="Times New Roman" w:eastAsia="Times New Roman" w:hAnsi="Times New Roman"/>
+          <w:sz w:val="22"/>
+          <w:szCs w:val="22"/>
+          <w:rtl w:val="0"/>
+        </w:rPr>
+        <w:t xml:space="preserve"> “farmer” — an echo of </w:t>
+      </w:r>
+      <w:r>
+        <w:rPr>
+          <w:rFonts w:ascii="Times New Roman" w:cs="Times New Roman" w:eastAsia="Times New Roman" w:hAnsi="Times New Roman"/>
+          <w:sz w:val="22"/>
+          <w:szCs w:val="22"/>
+          <w:i w:val="1"/>
+          <w:rtl w:val="0"/>
+        </w:rPr>
+        <w:t xml:space="preserve">tanda tangan</w:t>
+      </w:r>
+      <w:r>
+        <w:rPr>
+          <w:rFonts w:ascii="Times New Roman" w:cs="Times New Roman" w:eastAsia="Times New Roman" w:hAnsi="Times New Roman"/>
+          <w:sz w:val="22"/>
+          <w:szCs w:val="22"/>
+          <w:rtl w:val="0"/>
+        </w:rPr>
+        <w:t xml:space="preserve">, a signature) gives every smallholder plot a </w:t>
+      </w:r>
+      <w:r>
+        <w:rPr>
+          <w:rFonts w:ascii="Times New Roman" w:cs="Times New Roman" w:eastAsia="Times New Roman" w:hAnsi="Times New Roman"/>
+          <w:sz w:val="22"/>
+          <w:szCs w:val="22"/>
+          <w:b w:val="1"/>
+          <w:rtl w:val="0"/>
+        </w:rPr>
+        <w:t xml:space="preserve">cryptographically verifiable Plot Passport that the farmer owns</w:t>
+      </w:r>
+      <w:r>
+        <w:rPr>
+          <w:rFonts w:ascii="Times New Roman" w:cs="Times New Roman" w:eastAsia="Times New Roman" w:hAnsi="Times New Roman"/>
+          <w:sz w:val="22"/>
+          <w:szCs w:val="22"/>
+          <w:rtl w:val="0"/>
+        </w:rPr>
+        <w:t xml:space="preserve">, so Indonesia’s 1.6 million coffee-farming families</w:t>
+      </w:r>
+      <w:r>
+        <w:rPr>
+          <w:rFonts w:ascii="Times New Roman" w:cs="Times New Roman" w:eastAsia="Times New Roman" w:hAnsi="Times New Roman"/>
+          <w:sz w:val="22"/>
+          <w:szCs w:val="22"/>
+          <w:vertAlign w:val="superscript"/>
+          <w:rtl w:val="0"/>
+        </w:rPr>
+        <w:t xml:space="preserve">1</w:t>
+      </w:r>
+      <w:r>
+        <w:rPr>
+          <w:rFonts w:ascii="Times New Roman" w:cs="Times New Roman" w:eastAsia="Times New Roman" w:hAnsi="Times New Roman"/>
+          <w:sz w:val="22"/>
+          <w:szCs w:val="22"/>
+          <w:rtl w:val="0"/>
+        </w:rPr>
+        <w:t xml:space="preserve"> — and after them the palm, cocoa and rubber smallholders behind up to </w:t>
+      </w:r>
+      <w:r>
+        <w:rPr>
+          <w:rFonts w:ascii="Times New Roman" w:cs="Times New Roman" w:eastAsia="Times New Roman" w:hAnsi="Times New Roman"/>
+          <w:sz w:val="22"/>
+          <w:szCs w:val="22"/>
+          <w:b w:val="1"/>
+          <w:rtl w:val="0"/>
+        </w:rPr>
+        <w:t xml:space="preserve">US$7 billion</w:t>
+      </w:r>
+      <w:r>
+        <w:rPr>
+          <w:rFonts w:ascii="Times New Roman" w:cs="Times New Roman" w:eastAsia="Times New Roman" w:hAnsi="Times New Roman"/>
+          <w:sz w:val="22"/>
+          <w:szCs w:val="22"/>
+          <w:rtl w:val="0"/>
+        </w:rPr>
+        <w:t xml:space="preserve"> of exports</w:t>
+      </w:r>
+      <w:r>
+        <w:rPr>
+          <w:rFonts w:ascii="Times New Roman" w:cs="Times New Roman" w:eastAsia="Times New Roman" w:hAnsi="Times New Roman"/>
+          <w:sz w:val="22"/>
+          <w:szCs w:val="22"/>
+          <w:vertAlign w:val="superscript"/>
+          <w:rtl w:val="0"/>
+        </w:rPr>
+        <w:t xml:space="preserve">2</w:t>
+      </w:r>
+      <w:r>
+        <w:rPr>
+          <w:rFonts w:ascii="Times New Roman" w:cs="Times New Roman" w:eastAsia="Times New Roman" w:hAnsi="Times New Roman"/>
+          <w:sz w:val="22"/>
+          <w:szCs w:val="22"/>
+          <w:rtl w:val="0"/>
+        </w:rPr>
+        <w:t xml:space="preserve"> — are not locked out of Europe when the EU Deforestation Regulation takes effect on </w:t>
+      </w:r>
+      <w:r>
+        <w:rPr>
+          <w:rFonts w:ascii="Times New Roman" w:cs="Times New Roman" w:eastAsia="Times New Roman" w:hAnsi="Times New Roman"/>
+          <w:sz w:val="22"/>
+          <w:szCs w:val="22"/>
+          <w:b w:val="1"/>
+          <w:rtl w:val="0"/>
+        </w:rPr>
+        <w:t xml:space="preserve">30 December 2026</w:t>
+      </w:r>
+      <w:r>
+        <w:rPr>
+          <w:rFonts w:ascii="Times New Roman" w:cs="Times New Roman" w:eastAsia="Times New Roman" w:hAnsi="Times New Roman"/>
+          <w:sz w:val="22"/>
+          <w:szCs w:val="22"/>
+          <w:rtl w:val="0"/>
+        </w:rPr>
+        <w:t xml:space="preserve">.</w:t>
+      </w:r>
+      <w:r>
+        <w:rPr>
+          <w:rFonts w:ascii="Times New Roman" w:cs="Times New Roman" w:eastAsia="Times New Roman" w:hAnsi="Times New Roman"/>
+          <w:sz w:val="22"/>
+          <w:szCs w:val="22"/>
+          <w:vertAlign w:val="superscript"/>
+          <w:rtl w:val="0"/>
+        </w:rPr>
+        <w:t xml:space="preserve">3,4</w:t>
+      </w:r>
+      <w:r>
+        <w:rPr>
+          <w:rFonts w:ascii="Times New Roman" w:cs="Times New Roman" w:eastAsia="Times New Roman" w:hAnsi="Times New Roman"/>
+          <w:sz w:val="22"/>
+          <w:szCs w:val="22"/>
+          <w:rtl w:val="0"/>
+        </w:rPr>
+        <w:t xml:space="preserve"> The registration that doubles as a farmer’s geolocation record, e-STDB, covers just </w:t>
+      </w:r>
+      <w:r>
+        <w:rPr>
+          <w:rFonts w:ascii="Times New Roman" w:cs="Times New Roman" w:eastAsia="Times New Roman" w:hAnsi="Times New Roman"/>
+          <w:sz w:val="22"/>
+          <w:szCs w:val="22"/>
+          <w:b w:val="1"/>
+          <w:rtl w:val="0"/>
+        </w:rPr>
+        <w:t xml:space="preserve">0.03% of coffee farmers</w:t>
+      </w:r>
+      <w:r>
+        <w:rPr>
+          <w:rFonts w:ascii="Times New Roman" w:cs="Times New Roman" w:eastAsia="Times New Roman" w:hAnsi="Times New Roman"/>
+          <w:sz w:val="22"/>
+          <w:szCs w:val="22"/>
+          <w:rtl w:val="0"/>
+        </w:rPr>
+        <w:t xml:space="preserve"> today;</w:t>
+      </w:r>
+      <w:r>
+        <w:rPr>
+          <w:rFonts w:ascii="Times New Roman" w:cs="Times New Roman" w:eastAsia="Times New Roman" w:hAnsi="Times New Roman"/>
+          <w:sz w:val="22"/>
+          <w:szCs w:val="22"/>
+          <w:vertAlign w:val="superscript"/>
+          <w:rtl w:val="0"/>
+        </w:rPr>
+        <w:t xml:space="preserve">5</w:t>
+      </w:r>
+      <w:r>
+        <w:rPr>
+          <w:rFonts w:ascii="Times New Roman" w:cs="Times New Roman" w:eastAsia="Times New Roman" w:hAnsi="Times New Roman"/>
+          <w:sz w:val="22"/>
+          <w:szCs w:val="22"/>
+          <w:rtl w:val="0"/>
+        </w:rPr>
+        <w:t xml:space="preserve"> TandaTani closes that gap at the price of a WhatsApp message.</w:t>
+      </w:r>
+    </w:p>
+    <w:p>
+      <w:pPr>
+        <w:spacing w:after="110" w:before="0" w:line="276" w:lineRule="auto"/>
+        <w:ind w:left="720" w:firstLine="0"/>
+        <w:jc w:val="left"/>
+        <w:rPr>
+          <w:rFonts w:ascii="Times New Roman" w:cs="Times New Roman" w:eastAsia="Times New Roman" w:hAnsi="Times New Roman"/>
+          <w:sz w:val="22"/>
+          <w:szCs w:val="22"/>
+        </w:rPr>
+      </w:pPr>
+      <w:r>
+        <w:rPr>
+          <w:rFonts w:ascii="Times New Roman" w:cs="Times New Roman" w:eastAsia="Times New Roman" w:hAnsi="Times New Roman"/>
+          <w:sz w:val="22"/>
+          <w:szCs w:val="22"/>
+          <w:rtl w:val="0"/>
+        </w:rPr>
+        <w:t xml:space="preserve">A cooperative officer maps a plot in minutes on a </w:t>
+      </w:r>
+      <w:r>
+        <w:rPr>
+          <w:rFonts w:ascii="Times New Roman" w:cs="Times New Roman" w:eastAsia="Times New Roman" w:hAnsi="Times New Roman"/>
+          <w:sz w:val="22"/>
+          <w:szCs w:val="22"/>
+          <w:b w:val="1"/>
+          <w:rtl w:val="0"/>
+        </w:rPr>
+        <w:t xml:space="preserve">Bahasa-first, offline-capable app</w:t>
+      </w:r>
+      <w:r>
+        <w:rPr>
+          <w:rFonts w:ascii="Times New Roman" w:cs="Times New Roman" w:eastAsia="Times New Roman" w:hAnsi="Times New Roman"/>
+          <w:sz w:val="22"/>
+          <w:szCs w:val="22"/>
+          <w:rtl w:val="0"/>
+        </w:rPr>
+        <w:t xml:space="preserve">; an </w:t>
+      </w:r>
+      <w:r>
+        <w:rPr>
+          <w:rFonts w:ascii="Times New Roman" w:cs="Times New Roman" w:eastAsia="Times New Roman" w:hAnsi="Times New Roman"/>
+          <w:sz w:val="22"/>
+          <w:szCs w:val="22"/>
+          <w:b w:val="1"/>
+          <w:rtl w:val="0"/>
+        </w:rPr>
+        <w:t xml:space="preserve">AI engine</w:t>
+      </w:r>
+      <w:r>
+        <w:rPr>
+          <w:rFonts w:ascii="Times New Roman" w:cs="Times New Roman" w:eastAsia="Times New Roman" w:hAnsi="Times New Roman"/>
+          <w:sz w:val="22"/>
+          <w:szCs w:val="22"/>
+          <w:rtl w:val="0"/>
+        </w:rPr>
+        <w:t xml:space="preserve"> cross-examines it against official satellite forest data (FAO Whisp, JRC-2020 baseline, GLAD/RADD alerts)</w:t>
+      </w:r>
+      <w:r>
+        <w:rPr>
+          <w:rFonts w:ascii="Times New Roman" w:cs="Times New Roman" w:eastAsia="Times New Roman" w:hAnsi="Times New Roman"/>
+          <w:sz w:val="22"/>
+          <w:szCs w:val="22"/>
+          <w:vertAlign w:val="superscript"/>
+          <w:rtl w:val="0"/>
+        </w:rPr>
+        <w:t xml:space="preserve">6,7</w:t>
+      </w:r>
+      <w:r>
+        <w:rPr>
+          <w:rFonts w:ascii="Times New Roman" w:cs="Times New Roman" w:eastAsia="Times New Roman" w:hAnsi="Times New Roman"/>
+          <w:sz w:val="22"/>
+          <w:szCs w:val="22"/>
+          <w:rtl w:val="0"/>
+        </w:rPr>
+        <w:t xml:space="preserve"> and explains its verdict in plain Bahasa; the cooperative then signs a </w:t>
+      </w:r>
+      <w:r>
+        <w:rPr>
+          <w:rFonts w:ascii="Times New Roman" w:cs="Times New Roman" w:eastAsia="Times New Roman" w:hAnsi="Times New Roman"/>
+          <w:sz w:val="22"/>
+          <w:szCs w:val="22"/>
+          <w:b w:val="1"/>
+          <w:rtl w:val="0"/>
+        </w:rPr>
+        <w:t xml:space="preserve">W3C Verifiable Credential</w:t>
+      </w:r>
+      <w:r>
+        <w:rPr>
+          <w:rFonts w:ascii="Times New Roman" w:cs="Times New Roman" w:eastAsia="Times New Roman" w:hAnsi="Times New Roman"/>
+          <w:sz w:val="22"/>
+          <w:szCs w:val="22"/>
+          <w:vertAlign w:val="superscript"/>
+          <w:rtl w:val="0"/>
+        </w:rPr>
+        <w:t xml:space="preserve">8</w:t>
+      </w:r>
+      <w:r>
+        <w:rPr>
+          <w:rFonts w:ascii="Times New Roman" w:cs="Times New Roman" w:eastAsia="Times New Roman" w:hAnsi="Times New Roman"/>
+          <w:sz w:val="22"/>
+          <w:szCs w:val="22"/>
+          <w:rtl w:val="0"/>
+        </w:rPr>
+        <w:t xml:space="preserve"> the farmer keeps and can carry to </w:t>
+      </w:r>
+      <w:r>
+        <w:rPr>
+          <w:rFonts w:ascii="Times New Roman" w:cs="Times New Roman" w:eastAsia="Times New Roman" w:hAnsi="Times New Roman"/>
+          <w:sz w:val="22"/>
+          <w:szCs w:val="22"/>
+          <w:i w:val="1"/>
+          <w:rtl w:val="0"/>
+        </w:rPr>
+        <w:t xml:space="preserve">any</w:t>
+      </w:r>
+      <w:r>
+        <w:rPr>
+          <w:rFonts w:ascii="Times New Roman" w:cs="Times New Roman" w:eastAsia="Times New Roman" w:hAnsi="Times New Roman"/>
+          <w:sz w:val="22"/>
+          <w:szCs w:val="22"/>
+          <w:rtl w:val="0"/>
+        </w:rPr>
+        <w:t xml:space="preserve"> buyer, its evidence hash </w:t>
+      </w:r>
+      <w:r>
+        <w:rPr>
+          <w:rFonts w:ascii="Times New Roman" w:cs="Times New Roman" w:eastAsia="Times New Roman" w:hAnsi="Times New Roman"/>
+          <w:sz w:val="22"/>
+          <w:szCs w:val="22"/>
+          <w:b w:val="1"/>
+          <w:rtl w:val="0"/>
+        </w:rPr>
+        <w:t xml:space="preserve">anchored on the Polygon public chain</w:t>
+      </w:r>
+      <w:r>
+        <w:rPr>
+          <w:rFonts w:ascii="Times New Roman" w:cs="Times New Roman" w:eastAsia="Times New Roman" w:hAnsi="Times New Roman"/>
+          <w:sz w:val="22"/>
+          <w:szCs w:val="22"/>
+          <w:rtl w:val="0"/>
+        </w:rPr>
+        <w:t xml:space="preserve"> (≈ $0.001 per thousand plots</w:t>
+      </w:r>
+      <w:r>
+        <w:rPr>
+          <w:rFonts w:ascii="Times New Roman" w:cs="Times New Roman" w:eastAsia="Times New Roman" w:hAnsi="Times New Roman"/>
+          <w:sz w:val="22"/>
+          <w:szCs w:val="22"/>
+          <w:vertAlign w:val="superscript"/>
+          <w:rtl w:val="0"/>
+        </w:rPr>
+        <w:t xml:space="preserve">9</w:t>
+      </w:r>
+      <w:r>
+        <w:rPr>
+          <w:rFonts w:ascii="Times New Roman" w:cs="Times New Roman" w:eastAsia="Times New Roman" w:hAnsi="Times New Roman"/>
+          <w:sz w:val="22"/>
+          <w:szCs w:val="22"/>
+          <w:rtl w:val="0"/>
+        </w:rPr>
+        <w:t xml:space="preserve">). Exporters click once for an </w:t>
+      </w:r>
+      <w:r>
+        <w:rPr>
+          <w:rFonts w:ascii="Times New Roman" w:cs="Times New Roman" w:eastAsia="Times New Roman" w:hAnsi="Times New Roman"/>
+          <w:sz w:val="22"/>
+          <w:szCs w:val="22"/>
+          <w:b w:val="1"/>
+          <w:rtl w:val="0"/>
+        </w:rPr>
+        <w:t xml:space="preserve">EU-ready due-diligence dossier</w:t>
+      </w:r>
+      <w:r>
+        <w:rPr>
+          <w:rFonts w:ascii="Times New Roman" w:cs="Times New Roman" w:eastAsia="Times New Roman" w:hAnsi="Times New Roman"/>
+          <w:sz w:val="22"/>
+          <w:szCs w:val="22"/>
+          <w:rtl w:val="0"/>
+        </w:rPr>
+        <w:t xml:space="preserve"> (TRACES GeoJSON)</w:t>
+      </w:r>
+      <w:r>
+        <w:rPr>
+          <w:rFonts w:ascii="Times New Roman" w:cs="Times New Roman" w:eastAsia="Times New Roman" w:hAnsi="Times New Roman"/>
+          <w:sz w:val="22"/>
+          <w:szCs w:val="22"/>
+          <w:vertAlign w:val="superscript"/>
+          <w:rtl w:val="0"/>
+        </w:rPr>
+        <w:t xml:space="preserve">10</w:t>
+      </w:r>
+      <w:r>
+        <w:rPr>
+          <w:rFonts w:ascii="Times New Roman" w:cs="Times New Roman" w:eastAsia="Times New Roman" w:hAnsi="Times New Roman"/>
+          <w:sz w:val="22"/>
+          <w:szCs w:val="22"/>
+          <w:rtl w:val="0"/>
+        </w:rPr>
+        <w:t xml:space="preserve"> — and </w:t>
+      </w:r>
+      <w:r>
+        <w:rPr>
+          <w:rFonts w:ascii="Times New Roman" w:cs="Times New Roman" w:eastAsia="Times New Roman" w:hAnsi="Times New Roman"/>
+          <w:sz w:val="22"/>
+          <w:szCs w:val="22"/>
+          <w:b w:val="1"/>
+          <w:rtl w:val="0"/>
+        </w:rPr>
+        <w:t xml:space="preserve">anyone, including the judges reading this, can scan a QR and verify the entire chain of proof with no account, no permission, and no trust in us.</w:t>
+      </w:r>
+    </w:p>
+    <w:p>
+      <w:pPr>
         <w:spacing w:after="160" w:before="0" w:line="276" w:lineRule="auto"/>
         <w:ind w:left="720" w:firstLine="0"/>
         <w:jc w:val="left"/>
@@ -1643,95 +2095,9 @@
           <w:rFonts w:ascii="Times New Roman" w:cs="Times New Roman" w:eastAsia="Times New Roman" w:hAnsi="Times New Roman"/>
           <w:sz w:val="22"/>
           <w:szCs w:val="22"/>
-          <w:b w:val="1"/>
-          <w:rtl w:val="0"/>
-        </w:rPr>
-        <w:t xml:space="preserve">TANDATANI</w:t>
-      </w:r>
-      <w:r>
-        <w:rPr>
-          <w:rFonts w:ascii="Times New Roman" w:cs="Times New Roman" w:eastAsia="Times New Roman" w:hAnsi="Times New Roman"/>
-          <w:sz w:val="22"/>
-          <w:szCs w:val="22"/>
-          <w:rtl w:val="0"/>
-        </w:rPr>
-        <w:t xml:space="preserve"> (from Bahasa Indonesia </w:t>
-      </w:r>
-      <w:r>
-        <w:rPr>
-          <w:rFonts w:ascii="Times New Roman" w:cs="Times New Roman" w:eastAsia="Times New Roman" w:hAnsi="Times New Roman"/>
-          <w:sz w:val="22"/>
-          <w:szCs w:val="22"/>
-          <w:i w:val="1"/>
-          <w:rtl w:val="0"/>
-        </w:rPr>
-        <w:t xml:space="preserve">tanda</w:t>
-      </w:r>
-      <w:r>
-        <w:rPr>
-          <w:rFonts w:ascii="Times New Roman" w:cs="Times New Roman" w:eastAsia="Times New Roman" w:hAnsi="Times New Roman"/>
-          <w:sz w:val="22"/>
-          <w:szCs w:val="22"/>
-          <w:rtl w:val="0"/>
-        </w:rPr>
-        <w:t xml:space="preserve"> “mark” + </w:t>
-      </w:r>
-      <w:r>
-        <w:rPr>
-          <w:rFonts w:ascii="Times New Roman" w:cs="Times New Roman" w:eastAsia="Times New Roman" w:hAnsi="Times New Roman"/>
-          <w:sz w:val="22"/>
-          <w:szCs w:val="22"/>
-          <w:i w:val="1"/>
-          <w:rtl w:val="0"/>
-        </w:rPr>
-        <w:t xml:space="preserve">tani</w:t>
-      </w:r>
-      <w:r>
-        <w:rPr>
-          <w:rFonts w:ascii="Times New Roman" w:cs="Times New Roman" w:eastAsia="Times New Roman" w:hAnsi="Times New Roman"/>
-          <w:sz w:val="22"/>
-          <w:szCs w:val="22"/>
-          <w:rtl w:val="0"/>
-        </w:rPr>
-        <w:t xml:space="preserve"> “farmer” — an echo of </w:t>
-      </w:r>
-      <w:r>
-        <w:rPr>
-          <w:rFonts w:ascii="Times New Roman" w:cs="Times New Roman" w:eastAsia="Times New Roman" w:hAnsi="Times New Roman"/>
-          <w:sz w:val="22"/>
-          <w:szCs w:val="22"/>
-          <w:i w:val="1"/>
-          <w:rtl w:val="0"/>
-        </w:rPr>
-        <w:t xml:space="preserve">tanda tangan</w:t>
-      </w:r>
-      <w:r>
-        <w:rPr>
-          <w:rFonts w:ascii="Times New Roman" w:cs="Times New Roman" w:eastAsia="Times New Roman" w:hAnsi="Times New Roman"/>
-          <w:sz w:val="22"/>
-          <w:szCs w:val="22"/>
-          <w:rtl w:val="0"/>
-        </w:rPr>
-        <w:t xml:space="preserve">, a signature) gives every smallholder plot a </w:t>
-      </w:r>
-      <w:r>
-        <w:rPr>
-          <w:rFonts w:ascii="Times New Roman" w:cs="Times New Roman" w:eastAsia="Times New Roman" w:hAnsi="Times New Roman"/>
-          <w:sz w:val="22"/>
-          <w:szCs w:val="22"/>
-          <w:b w:val="1"/>
-          <w:rtl w:val="0"/>
-        </w:rPr>
-        <w:t xml:space="preserve">cryptographically verifiable Plot Passport</w:t>
-      </w:r>
-      <w:r>
-        <w:rPr>
-          <w:rFonts w:ascii="Times New Roman" w:cs="Times New Roman" w:eastAsia="Times New Roman" w:hAnsi="Times New Roman"/>
-          <w:sz w:val="22"/>
-          <w:szCs w:val="22"/>
-          <w:rtl w:val="0"/>
-        </w:rPr>
-        <w:t xml:space="preserve">, so Indonesia’s 1.6 million coffee-farming families</w:t>
+          <w:rtl w:val="0"/>
+        </w:rPr>
+        <w:t xml:space="preserve">Farmers pay nothing; exporters pay per shipment — two orders of magnitude below today’s €800-per-day consultants</w:t>
       </w:r>
       <w:r>
         <w:rPr>
@@ -1741,320 +2107,6 @@
           <w:vertAlign w:val="superscript"/>
           <w:rtl w:val="0"/>
         </w:rPr>
-        <w:t xml:space="preserve">1</w:t>
-      </w:r>
-      <w:r>
-        <w:rPr>
-          <w:rFonts w:ascii="Times New Roman" w:cs="Times New Roman" w:eastAsia="Times New Roman" w:hAnsi="Times New Roman"/>
-          <w:sz w:val="22"/>
-          <w:szCs w:val="22"/>
-          <w:rtl w:val="0"/>
-        </w:rPr>
-        <w:t xml:space="preserve"> — and after them the palm, cocoa and rubber smallholders behind up to </w:t>
-      </w:r>
-      <w:r>
-        <w:rPr>
-          <w:rFonts w:ascii="Times New Roman" w:cs="Times New Roman" w:eastAsia="Times New Roman" w:hAnsi="Times New Roman"/>
-          <w:sz w:val="22"/>
-          <w:szCs w:val="22"/>
-          <w:b w:val="1"/>
-          <w:rtl w:val="0"/>
-        </w:rPr>
-        <w:t xml:space="preserve">US$7 billion</w:t>
-      </w:r>
-      <w:r>
-        <w:rPr>
-          <w:rFonts w:ascii="Times New Roman" w:cs="Times New Roman" w:eastAsia="Times New Roman" w:hAnsi="Times New Roman"/>
-          <w:sz w:val="22"/>
-          <w:szCs w:val="22"/>
-          <w:rtl w:val="0"/>
-        </w:rPr>
-        <w:t xml:space="preserve"> of exports</w:t>
-      </w:r>
-      <w:r>
-        <w:rPr>
-          <w:rFonts w:ascii="Times New Roman" w:cs="Times New Roman" w:eastAsia="Times New Roman" w:hAnsi="Times New Roman"/>
-          <w:sz w:val="22"/>
-          <w:szCs w:val="22"/>
-          <w:vertAlign w:val="superscript"/>
-          <w:rtl w:val="0"/>
-        </w:rPr>
-        <w:t xml:space="preserve">2</w:t>
-      </w:r>
-      <w:r>
-        <w:rPr>
-          <w:rFonts w:ascii="Times New Roman" w:cs="Times New Roman" w:eastAsia="Times New Roman" w:hAnsi="Times New Roman"/>
-          <w:sz w:val="22"/>
-          <w:szCs w:val="22"/>
-          <w:rtl w:val="0"/>
-        </w:rPr>
-        <w:t xml:space="preserve"> — are not locked out of Europe when the EU Deforestation Regulation takes effect on </w:t>
-      </w:r>
-      <w:r>
-        <w:rPr>
-          <w:rFonts w:ascii="Times New Roman" w:cs="Times New Roman" w:eastAsia="Times New Roman" w:hAnsi="Times New Roman"/>
-          <w:sz w:val="22"/>
-          <w:szCs w:val="22"/>
-          <w:b w:val="1"/>
-          <w:rtl w:val="0"/>
-        </w:rPr>
-        <w:t xml:space="preserve">30 December 2026</w:t>
-      </w:r>
-      <w:r>
-        <w:rPr>
-          <w:rFonts w:ascii="Times New Roman" w:cs="Times New Roman" w:eastAsia="Times New Roman" w:hAnsi="Times New Roman"/>
-          <w:sz w:val="22"/>
-          <w:szCs w:val="22"/>
-          <w:rtl w:val="0"/>
-        </w:rPr>
-        <w:t xml:space="preserve">.</w:t>
-      </w:r>
-      <w:r>
-        <w:rPr>
-          <w:rFonts w:ascii="Times New Roman" w:cs="Times New Roman" w:eastAsia="Times New Roman" w:hAnsi="Times New Roman"/>
-          <w:sz w:val="22"/>
-          <w:szCs w:val="22"/>
-          <w:vertAlign w:val="superscript"/>
-          <w:rtl w:val="0"/>
-        </w:rPr>
-        <w:t xml:space="preserve">3,4</w:t>
-      </w:r>
-      <w:r>
-        <w:rPr>
-          <w:rFonts w:ascii="Times New Roman" w:cs="Times New Roman" w:eastAsia="Times New Roman" w:hAnsi="Times New Roman"/>
-          <w:sz w:val="22"/>
-          <w:szCs w:val="22"/>
-          <w:rtl w:val="0"/>
-        </w:rPr>
-        <w:t xml:space="preserve"> Today, e-STDB — the government registration that doubles as a farmer’s geolocation record — covers just </w:t>
-      </w:r>
-      <w:r>
-        <w:rPr>
-          <w:rFonts w:ascii="Times New Roman" w:cs="Times New Roman" w:eastAsia="Times New Roman" w:hAnsi="Times New Roman"/>
-          <w:sz w:val="22"/>
-          <w:szCs w:val="22"/>
-          <w:b w:val="1"/>
-          <w:rtl w:val="0"/>
-        </w:rPr>
-        <w:t xml:space="preserve">0.03% of coffee farmers</w:t>
-      </w:r>
-      <w:r>
-        <w:rPr>
-          <w:rFonts w:ascii="Times New Roman" w:cs="Times New Roman" w:eastAsia="Times New Roman" w:hAnsi="Times New Roman"/>
-          <w:sz w:val="22"/>
-          <w:szCs w:val="22"/>
-          <w:rtl w:val="0"/>
-        </w:rPr>
-        <w:t xml:space="preserve">;</w:t>
-      </w:r>
-      <w:r>
-        <w:rPr>
-          <w:rFonts w:ascii="Times New Roman" w:cs="Times New Roman" w:eastAsia="Times New Roman" w:hAnsi="Times New Roman"/>
-          <w:sz w:val="22"/>
-          <w:szCs w:val="22"/>
-          <w:vertAlign w:val="superscript"/>
-          <w:rtl w:val="0"/>
-        </w:rPr>
-        <w:t xml:space="preserve">5</w:t>
-      </w:r>
-      <w:r>
-        <w:rPr>
-          <w:rFonts w:ascii="Times New Roman" w:cs="Times New Roman" w:eastAsia="Times New Roman" w:hAnsi="Times New Roman"/>
-          <w:sz w:val="22"/>
-          <w:szCs w:val="22"/>
-          <w:rtl w:val="0"/>
-        </w:rPr>
-        <w:t xml:space="preserve"> TandaTani closes that gap at the price of a WhatsApp message. A cooperative officer maps a plot in minutes on a </w:t>
-      </w:r>
-      <w:r>
-        <w:rPr>
-          <w:rFonts w:ascii="Times New Roman" w:cs="Times New Roman" w:eastAsia="Times New Roman" w:hAnsi="Times New Roman"/>
-          <w:sz w:val="22"/>
-          <w:szCs w:val="22"/>
-          <w:b w:val="1"/>
-          <w:rtl w:val="0"/>
-        </w:rPr>
-        <w:t xml:space="preserve">Bahasa-first, offline-capable app</w:t>
-      </w:r>
-      <w:r>
-        <w:rPr>
-          <w:rFonts w:ascii="Times New Roman" w:cs="Times New Roman" w:eastAsia="Times New Roman" w:hAnsi="Times New Roman"/>
-          <w:sz w:val="22"/>
-          <w:szCs w:val="22"/>
-          <w:rtl w:val="0"/>
-        </w:rPr>
-        <w:t xml:space="preserve">; an </w:t>
-      </w:r>
-      <w:r>
-        <w:rPr>
-          <w:rFonts w:ascii="Times New Roman" w:cs="Times New Roman" w:eastAsia="Times New Roman" w:hAnsi="Times New Roman"/>
-          <w:sz w:val="22"/>
-          <w:szCs w:val="22"/>
-          <w:b w:val="1"/>
-          <w:rtl w:val="0"/>
-        </w:rPr>
-        <w:t xml:space="preserve">AI engine</w:t>
-      </w:r>
-      <w:r>
-        <w:rPr>
-          <w:rFonts w:ascii="Times New Roman" w:cs="Times New Roman" w:eastAsia="Times New Roman" w:hAnsi="Times New Roman"/>
-          <w:sz w:val="22"/>
-          <w:szCs w:val="22"/>
-          <w:rtl w:val="0"/>
-        </w:rPr>
-        <w:t xml:space="preserve"> cross-examines it against official satellite forest data (FAO Whisp, JRC-2020 baseline, GLAD/RADD alerts)</w:t>
-      </w:r>
-      <w:r>
-        <w:rPr>
-          <w:rFonts w:ascii="Times New Roman" w:cs="Times New Roman" w:eastAsia="Times New Roman" w:hAnsi="Times New Roman"/>
-          <w:sz w:val="22"/>
-          <w:szCs w:val="22"/>
-          <w:vertAlign w:val="superscript"/>
-          <w:rtl w:val="0"/>
-        </w:rPr>
-        <w:t xml:space="preserve">6,7</w:t>
-      </w:r>
-      <w:r>
-        <w:rPr>
-          <w:rFonts w:ascii="Times New Roman" w:cs="Times New Roman" w:eastAsia="Times New Roman" w:hAnsi="Times New Roman"/>
-          <w:sz w:val="22"/>
-          <w:szCs w:val="22"/>
-          <w:rtl w:val="0"/>
-        </w:rPr>
-        <w:t xml:space="preserve"> and explains its verdict in plain Bahasa; the cooperative signs a </w:t>
-      </w:r>
-      <w:r>
-        <w:rPr>
-          <w:rFonts w:ascii="Times New Roman" w:cs="Times New Roman" w:eastAsia="Times New Roman" w:hAnsi="Times New Roman"/>
-          <w:sz w:val="22"/>
-          <w:szCs w:val="22"/>
-          <w:b w:val="1"/>
-          <w:rtl w:val="0"/>
-        </w:rPr>
-        <w:t xml:space="preserve">W3C Verifiable Credential</w:t>
-      </w:r>
-      <w:r>
-        <w:rPr>
-          <w:rFonts w:ascii="Times New Roman" w:cs="Times New Roman" w:eastAsia="Times New Roman" w:hAnsi="Times New Roman"/>
-          <w:sz w:val="22"/>
-          <w:szCs w:val="22"/>
-          <w:vertAlign w:val="superscript"/>
-          <w:rtl w:val="0"/>
-        </w:rPr>
-        <w:t xml:space="preserve">8</w:t>
-      </w:r>
-      <w:r>
-        <w:rPr>
-          <w:rFonts w:ascii="Times New Roman" w:cs="Times New Roman" w:eastAsia="Times New Roman" w:hAnsi="Times New Roman"/>
-          <w:sz w:val="22"/>
-          <w:szCs w:val="22"/>
-          <w:rtl w:val="0"/>
-        </w:rPr>
-        <w:t xml:space="preserve"> that the farmer owns and can carry to </w:t>
-      </w:r>
-      <w:r>
-        <w:rPr>
-          <w:rFonts w:ascii="Times New Roman" w:cs="Times New Roman" w:eastAsia="Times New Roman" w:hAnsi="Times New Roman"/>
-          <w:sz w:val="22"/>
-          <w:szCs w:val="22"/>
-          <w:i w:val="1"/>
-          <w:rtl w:val="0"/>
-        </w:rPr>
-        <w:t xml:space="preserve">any</w:t>
-      </w:r>
-      <w:r>
-        <w:rPr>
-          <w:rFonts w:ascii="Times New Roman" w:cs="Times New Roman" w:eastAsia="Times New Roman" w:hAnsi="Times New Roman"/>
-          <w:sz w:val="22"/>
-          <w:szCs w:val="22"/>
-          <w:rtl w:val="0"/>
-        </w:rPr>
-        <w:t xml:space="preserve"> buyer, its evidence hash </w:t>
-      </w:r>
-      <w:r>
-        <w:rPr>
-          <w:rFonts w:ascii="Times New Roman" w:cs="Times New Roman" w:eastAsia="Times New Roman" w:hAnsi="Times New Roman"/>
-          <w:sz w:val="22"/>
-          <w:szCs w:val="22"/>
-          <w:b w:val="1"/>
-          <w:rtl w:val="0"/>
-        </w:rPr>
-        <w:t xml:space="preserve">anchored on the Polygon public chain</w:t>
-      </w:r>
-      <w:r>
-        <w:rPr>
-          <w:rFonts w:ascii="Times New Roman" w:cs="Times New Roman" w:eastAsia="Times New Roman" w:hAnsi="Times New Roman"/>
-          <w:sz w:val="22"/>
-          <w:szCs w:val="22"/>
-          <w:rtl w:val="0"/>
-        </w:rPr>
-        <w:t xml:space="preserve"> (≈ $0.001 per thousand plots</w:t>
-      </w:r>
-      <w:r>
-        <w:rPr>
-          <w:rFonts w:ascii="Times New Roman" w:cs="Times New Roman" w:eastAsia="Times New Roman" w:hAnsi="Times New Roman"/>
-          <w:sz w:val="22"/>
-          <w:szCs w:val="22"/>
-          <w:vertAlign w:val="superscript"/>
-          <w:rtl w:val="0"/>
-        </w:rPr>
-        <w:t xml:space="preserve">9</w:t>
-      </w:r>
-      <w:r>
-        <w:rPr>
-          <w:rFonts w:ascii="Times New Roman" w:cs="Times New Roman" w:eastAsia="Times New Roman" w:hAnsi="Times New Roman"/>
-          <w:sz w:val="22"/>
-          <w:szCs w:val="22"/>
-          <w:rtl w:val="0"/>
-        </w:rPr>
-        <w:t xml:space="preserve">). Exporters click once for an </w:t>
-      </w:r>
-      <w:r>
-        <w:rPr>
-          <w:rFonts w:ascii="Times New Roman" w:cs="Times New Roman" w:eastAsia="Times New Roman" w:hAnsi="Times New Roman"/>
-          <w:sz w:val="22"/>
-          <w:szCs w:val="22"/>
-          <w:b w:val="1"/>
-          <w:rtl w:val="0"/>
-        </w:rPr>
-        <w:t xml:space="preserve">EU-ready due-diligence dossier</w:t>
-      </w:r>
-      <w:r>
-        <w:rPr>
-          <w:rFonts w:ascii="Times New Roman" w:cs="Times New Roman" w:eastAsia="Times New Roman" w:hAnsi="Times New Roman"/>
-          <w:sz w:val="22"/>
-          <w:szCs w:val="22"/>
-          <w:rtl w:val="0"/>
-        </w:rPr>
-        <w:t xml:space="preserve"> (TRACES GeoJSON)</w:t>
-      </w:r>
-      <w:r>
-        <w:rPr>
-          <w:rFonts w:ascii="Times New Roman" w:cs="Times New Roman" w:eastAsia="Times New Roman" w:hAnsi="Times New Roman"/>
-          <w:sz w:val="22"/>
-          <w:szCs w:val="22"/>
-          <w:vertAlign w:val="superscript"/>
-          <w:rtl w:val="0"/>
-        </w:rPr>
-        <w:t xml:space="preserve">10</w:t>
-      </w:r>
-      <w:r>
-        <w:rPr>
-          <w:rFonts w:ascii="Times New Roman" w:cs="Times New Roman" w:eastAsia="Times New Roman" w:hAnsi="Times New Roman"/>
-          <w:sz w:val="22"/>
-          <w:szCs w:val="22"/>
-          <w:rtl w:val="0"/>
-        </w:rPr>
-        <w:t xml:space="preserve">, and anyone can scan a QR to verify the whole chain of proof — no account, no permission, no trust in us required. Farmers pay nothing; exporters pay per shipment — two orders of magnitude below today’s €800-per-day consultants</w:t>
-      </w:r>
-      <w:r>
-        <w:rPr>
-          <w:rFonts w:ascii="Times New Roman" w:cs="Times New Roman" w:eastAsia="Times New Roman" w:hAnsi="Times New Roman"/>
-          <w:sz w:val="22"/>
-          <w:szCs w:val="22"/>
-          <w:vertAlign w:val="superscript"/>
-          <w:rtl w:val="0"/>
-        </w:rPr>
         <w:t xml:space="preserve">11</w:t>
       </w:r>
       <w:r>
@@ -2064,7 +2116,7 @@
           <w:szCs w:val="22"/>
           <w:rtl w:val="0"/>
         </w:rPr>
-        <w:t xml:space="preserve"> — for compliance that unlocks a documented </w:t>
+        <w:t xml:space="preserve"> — for compliance that carries a documented </w:t>
       </w:r>
       <w:r>
         <w:rPr>
@@ -2083,7 +2135,7 @@
           <w:szCs w:val="22"/>
           <w:rtl w:val="0"/>
         </w:rPr>
-        <w:t xml:space="preserve">.</w:t>
+        <w:t xml:space="preserve"> (Vietnamese-robusta benchmark).</w:t>
       </w:r>
       <w:r>
         <w:rPr>
@@ -3898,7 +3950,83 @@
           <w:szCs w:val="22"/>
           <w:rtl w:val="0"/>
         </w:rPr>
-        <w:t xml:space="preserve">Indonesia’s harvest is real, the land is clean, but the evidence lives in paper folders, WhatsApp photos and enterprise databases the farmer will never control. TandaTani’s answer: give the proof itself to the person who created it.</w:t>
+        <w:t xml:space="preserve">Indonesia’s harvest is real, the land is clean, but the evidence lives in paper folders, WhatsApp photos and enterprise databases the farmer will never control. TandaTani’s answer: give the proof itself to the person who created it. Every ingredient we use exists; the </w:t>
+      </w:r>
+      <w:r>
+        <w:rPr>
+          <w:rFonts w:ascii="Times New Roman" w:cs="Times New Roman" w:eastAsia="Times New Roman" w:hAnsi="Times New Roman"/>
+          <w:sz w:val="22"/>
+          <w:szCs w:val="22"/>
+          <w:b w:val="1"/>
+          <w:rtl w:val="0"/>
+        </w:rPr>
+        <w:t xml:space="preserve">combination</w:t>
+      </w:r>
+      <w:r>
+        <w:rPr>
+          <w:rFonts w:ascii="Times New Roman" w:cs="Times New Roman" w:eastAsia="Times New Roman" w:hAnsi="Times New Roman"/>
+          <w:sz w:val="22"/>
+          <w:szCs w:val="22"/>
+          <w:rtl w:val="0"/>
+        </w:rPr>
+        <w:t xml:space="preserve"> — a compliance credential the </w:t>
+      </w:r>
+      <w:r>
+        <w:rPr>
+          <w:rFonts w:ascii="Times New Roman" w:cs="Times New Roman" w:eastAsia="Times New Roman" w:hAnsi="Times New Roman"/>
+          <w:sz w:val="22"/>
+          <w:szCs w:val="22"/>
+          <w:i w:val="1"/>
+          <w:rtl w:val="0"/>
+        </w:rPr>
+        <w:t xml:space="preserve">farmer</w:t>
+      </w:r>
+      <w:r>
+        <w:rPr>
+          <w:rFonts w:ascii="Times New Roman" w:cs="Times New Roman" w:eastAsia="Times New Roman" w:hAnsi="Times New Roman"/>
+          <w:sz w:val="22"/>
+          <w:szCs w:val="22"/>
+          <w:rtl w:val="0"/>
+        </w:rPr>
+        <w:t xml:space="preserve"> owns, priced </w:t>
+      </w:r>
+      <w:r>
+        <w:rPr>
+          <w:rFonts w:ascii="Times New Roman" w:cs="Times New Roman" w:eastAsia="Times New Roman" w:hAnsi="Times New Roman"/>
+          <w:sz w:val="22"/>
+          <w:szCs w:val="22"/>
+          <w:i w:val="1"/>
+          <w:rtl w:val="0"/>
+        </w:rPr>
+        <w:t xml:space="preserve">per shipment</w:t>
+      </w:r>
+      <w:r>
+        <w:rPr>
+          <w:rFonts w:ascii="Times New Roman" w:cs="Times New Roman" w:eastAsia="Times New Roman" w:hAnsi="Times New Roman"/>
+          <w:sz w:val="22"/>
+          <w:szCs w:val="22"/>
+          <w:rtl w:val="0"/>
+        </w:rPr>
+        <w:t xml:space="preserve">, verifiable by </w:t>
+      </w:r>
+      <w:r>
+        <w:rPr>
+          <w:rFonts w:ascii="Times New Roman" w:cs="Times New Roman" w:eastAsia="Times New Roman" w:hAnsi="Times New Roman"/>
+          <w:sz w:val="22"/>
+          <w:szCs w:val="22"/>
+          <w:i w:val="1"/>
+          <w:rtl w:val="0"/>
+        </w:rPr>
+        <w:t xml:space="preserve">anyone</w:t>
+      </w:r>
+      <w:r>
+        <w:rPr>
+          <w:rFonts w:ascii="Times New Roman" w:cs="Times New Roman" w:eastAsia="Times New Roman" w:hAnsi="Times New Roman"/>
+          <w:sz w:val="22"/>
+          <w:szCs w:val="22"/>
+          <w:rtl w:val="0"/>
+        </w:rPr>
+        <w:t xml:space="preserve"> without an account — exists nowhere in production, and §3.5 shows why incumbents cannot copy it without breaking their own business model.</w:t>
       </w:r>
     </w:p>
     <w:p>
@@ -4176,6 +4304,56 @@
     </w:p>
     <w:p>
       <w:pPr>
+        <w:spacing w:after="120" w:before="0" w:line="276" w:lineRule="auto"/>
+        <w:ind w:left="720" w:firstLine="0"/>
+        <w:jc w:val="left"/>
+        <w:rPr>
+          <w:rFonts w:ascii="Times New Roman" w:cs="Times New Roman" w:eastAsia="Times New Roman" w:hAnsi="Times New Roman"/>
+          <w:sz w:val="22"/>
+          <w:szCs w:val="22"/>
+        </w:rPr>
+      </w:pPr>
+      <w:r>
+        <w:rPr>
+          <w:rFonts w:ascii="Times New Roman" w:cs="Times New Roman" w:eastAsia="Times New Roman" w:hAnsi="Times New Roman"/>
+          <w:sz w:val="22"/>
+          <w:szCs w:val="22"/>
+          <w:b w:val="1"/>
+          <w:rtl w:val="0"/>
+        </w:rPr>
+        <w:t xml:space="preserve">Scope honesty — the legality pillar.</w:t>
+      </w:r>
+      <w:r>
+        <w:rPr>
+          <w:rFonts w:ascii="Times New Roman" w:cs="Times New Roman" w:eastAsia="Times New Roman" w:hAnsi="Times New Roman"/>
+          <w:sz w:val="22"/>
+          <w:szCs w:val="22"/>
+          <w:rtl w:val="0"/>
+        </w:rPr>
+        <w:t xml:space="preserve"> EUDR demands two proofs: deforestation-free </w:t>
+      </w:r>
+      <w:r>
+        <w:rPr>
+          <w:rFonts w:ascii="Times New Roman" w:cs="Times New Roman" w:eastAsia="Times New Roman" w:hAnsi="Times New Roman"/>
+          <w:sz w:val="22"/>
+          <w:szCs w:val="22"/>
+          <w:i w:val="1"/>
+          <w:rtl w:val="0"/>
+        </w:rPr>
+        <w:t xml:space="preserve">and</w:t>
+      </w:r>
+      <w:r>
+        <w:rPr>
+          <w:rFonts w:ascii="Times New Roman" w:cs="Times New Roman" w:eastAsia="Times New Roman" w:hAnsi="Times New Roman"/>
+          <w:sz w:val="22"/>
+          <w:szCs w:val="22"/>
+          <w:rtl w:val="0"/>
+        </w:rPr>
+        <w:t xml:space="preserve"> legal production. TandaTani verifies the first from satellites; for the second it structures and hash-seals the farmer’s legality evidence (e-STDB, land letters, cooperative membership), checks it for presence and internal consistency, and records who attested it — while authenticity verification remains with the issuing authorities. The dossier is evidence the exporter files under its own due-diligence responsibility; we do not replace that duty — we make it affordable to discharge.</w:t>
+      </w:r>
+    </w:p>
+    <w:p>
+      <w:pPr>
         <w:keepNext w:val="1"/>
         <w:spacing w:after="80" w:before="160" w:line="240" w:lineRule="auto"/>
         <w:ind w:left="720" w:firstLine="0"/>
@@ -4331,7 +4509,7 @@
           <w:szCs w:val="22"/>
           <w:rtl w:val="0"/>
         </w:rPr>
-        <w:t xml:space="preserve"> plus a QR-coded evidence certificate. The importer scans the QR: hash matches, signature valid, root on-chain — due diligence, defensible in an audit five years later.</w:t>
+        <w:t xml:space="preserve"> plus a QR-coded evidence certificate. The importer scans the QR: hash matches, signature valid, root on-chain — due diligence the importer can re-verify, byte for byte, five years from now.</w:t>
       </w:r>
     </w:p>
     <w:p>
@@ -6231,7 +6409,7 @@
                 <w:b w:val="1"/>
                 <w:rtl w:val="0"/>
               </w:rPr>
-              <w:t xml:space="preserve">Member A — Frontend / PWA</w:t>
+              <w:t xml:space="preserve">Builder 1 (S. Gupta) — Web3 / Infra</w:t>
             </w:r>
           </w:p>
         </w:tc>
@@ -6266,7 +6444,7 @@
                 <w:b w:val="1"/>
                 <w:rtl w:val="0"/>
               </w:rPr>
-              <w:t xml:space="preserve">Member B — Backend / AI</w:t>
+              <w:t xml:space="preserve">Builder 2 — Frontend / PWA</w:t>
             </w:r>
           </w:p>
         </w:tc>
@@ -6301,7 +6479,7 @@
                 <w:b w:val="1"/>
                 <w:rtl w:val="0"/>
               </w:rPr>
-              <w:t xml:space="preserve">Member C — Web3 / Infra</w:t>
+              <w:t xml:space="preserve">Builder 3 — Backend / AI</w:t>
             </w:r>
           </w:p>
         </w:tc>
@@ -6367,7 +6545,7 @@
                 <w:szCs w:val="17"/>
                 <w:rtl w:val="0"/>
               </w:rPr>
-              <w:t xml:space="preserve">App shell; map capture; offline queue</w:t>
+              <w:t xml:space="preserve">Repo/CI; Vercel + Supabase; deploy TandaRegistry.sol to Amoy</w:t>
             </w:r>
           </w:p>
         </w:tc>
@@ -6399,7 +6577,7 @@
                 <w:szCs w:val="17"/>
                 <w:rtl w:val="0"/>
               </w:rPr>
-              <w:t xml:space="preserve">Supabase schema + PostGIS; API skeleton</w:t>
+              <w:t xml:space="preserve">App shell; map capture; offline queue</w:t>
             </w:r>
           </w:p>
         </w:tc>
@@ -6431,7 +6609,7 @@
                 <w:szCs w:val="17"/>
                 <w:rtl w:val="0"/>
               </w:rPr>
-              <w:t xml:space="preserve">Repo/CI; Vercel + Supabase; deploy TandaRegistry.sol to Amoy</w:t>
+              <w:t xml:space="preserve">Supabase schema + PostGIS; API skeleton</w:t>
             </w:r>
           </w:p>
         </w:tc>
@@ -6497,7 +6675,7 @@
                 <w:szCs w:val="17"/>
                 <w:rtl w:val="0"/>
               </w:rPr>
-              <w:t xml:space="preserve">Farmer flows; verification result UI</w:t>
+              <w:t xml:space="preserve">VC issuance service (did:key, Ed25519)</w:t>
             </w:r>
           </w:p>
         </w:tc>
@@ -6529,7 +6707,7 @@
                 <w:szCs w:val="17"/>
                 <w:rtl w:val="0"/>
               </w:rPr>
-              <w:t xml:space="preserve">Whisp + GFW integration; risk scorer</w:t>
+              <w:t xml:space="preserve">Farmer flows; verification result UI</w:t>
             </w:r>
           </w:p>
         </w:tc>
@@ -6561,7 +6739,7 @@
                 <w:szCs w:val="17"/>
                 <w:rtl w:val="0"/>
               </w:rPr>
-              <w:t xml:space="preserve">VC issuance service (did:key, Ed25519)</w:t>
+              <w:t xml:space="preserve">Whisp + GFW integration; risk scorer</w:t>
             </w:r>
           </w:p>
         </w:tc>
@@ -6627,7 +6805,7 @@
                 <w:szCs w:val="17"/>
                 <w:rtl w:val="0"/>
               </w:rPr>
-              <w:t xml:space="preserve">Cooperative Console</w:t>
+              <w:t xml:space="preserve">Merkle batcher + anchoring worker</w:t>
             </w:r>
           </w:p>
         </w:tc>
@@ -6659,7 +6837,7 @@
                 <w:szCs w:val="17"/>
                 <w:rtl w:val="0"/>
               </w:rPr>
-              <w:t xml:space="preserve">Gemini Bahasa verdicts; Tanya Tani</w:t>
+              <w:t xml:space="preserve">Cooperative Console</w:t>
             </w:r>
           </w:p>
         </w:tc>
@@ -6691,7 +6869,7 @@
                 <w:szCs w:val="17"/>
                 <w:rtl w:val="0"/>
               </w:rPr>
-              <w:t xml:space="preserve">Merkle batcher + anchoring worker</w:t>
+              <w:t xml:space="preserve">Gemini Bahasa verdicts; Tanya Tani</w:t>
             </w:r>
           </w:p>
         </w:tc>
@@ -6757,7 +6935,7 @@
                 <w:szCs w:val="17"/>
                 <w:rtl w:val="0"/>
               </w:rPr>
-              <w:t xml:space="preserve">Exporter DDS Studio</w:t>
+              <w:t xml:space="preserve">Public verify page (hash + proof in browser)</w:t>
             </w:r>
           </w:p>
         </w:tc>
@@ -6789,7 +6967,7 @@
                 <w:szCs w:val="17"/>
                 <w:rtl w:val="0"/>
               </w:rPr>
-              <w:t xml:space="preserve">TRACES GeoJSON + PDF dossier generator</w:t>
+              <w:t xml:space="preserve">Exporter DDS Studio</w:t>
             </w:r>
           </w:p>
         </w:tc>
@@ -6821,7 +6999,7 @@
                 <w:szCs w:val="17"/>
                 <w:rtl w:val="0"/>
               </w:rPr>
-              <w:t xml:space="preserve">Public verify page (hash + proof in browser)</w:t>
+              <w:t xml:space="preserve">TRACES GeoJSON + PDF dossier generator</w:t>
             </w:r>
           </w:p>
         </w:tc>
@@ -7781,7 +7959,7 @@
                 <w:szCs w:val="18"/>
                 <w:rtl w:val="0"/>
               </w:rPr>
-              <w:t xml:space="preserve">3 cooperatives · ≈8,000 member plots · 2 exporters · ≈200 EU-bound containers</w:t>
+              <w:t xml:space="preserve">3 co-ops · 8,000 members × €1.40 × 2 harvest seasons + 2 exporters · 200 dossiers × €45 ≈ €31k</w:t>
             </w:r>
           </w:p>
         </w:tc>
@@ -7813,7 +7991,7 @@
                 <w:szCs w:val="18"/>
                 <w:rtl w:val="0"/>
               </w:rPr>
-              <w:t xml:space="preserve">≈US$60–90k ARR</w:t>
+              <w:t xml:space="preserve">≈US$33k ARR</w:t>
             </w:r>
           </w:p>
         </w:tc>
@@ -9384,7 +9562,7 @@
           <w:color w:val="666666"/>
           <w:rtl w:val="0"/>
         </w:rPr>
-        <w:t xml:space="preserve">Figure 1 — TandaTani system architecture and data flow. Numbered chips ①–⑨ match §6.1.</w:t>
+        <w:t xml:space="preserve">Figure 1 — TandaTani system architecture and data flow. Numbered chips on the arrows match the data-flow steps in §6.1.</w:t>
       </w:r>
     </w:p>
     <w:p>
@@ -9471,7 +9649,7 @@
           <w:szCs w:val="21"/>
           <w:rtl w:val="0"/>
         </w:rPr>
-        <w:t xml:space="preserve">  Sync to the API (Next.js route handlers, Zod-validated); plots land in Postgres/PostGIS.</w:t>
+        <w:t xml:space="preserve">  Sync to the API (Next.js route handlers, Zod-validated); plots land in Postgres/PostGIS,</w:t>
       </w:r>
       <w:r>
         <w:rPr>
@@ -9483,6 +9661,15 @@
         </w:rPr>
         <w:t xml:space="preserve">39</w:t>
       </w:r>
+      <w:r>
+        <w:rPr>
+          <w:rFonts w:ascii="Times New Roman" w:cs="Times New Roman" w:eastAsia="Times New Roman" w:hAnsi="Times New Roman"/>
+          <w:sz w:val="21"/>
+          <w:szCs w:val="21"/>
+          <w:rtl w:val="0"/>
+        </w:rPr>
+        <w:t xml:space="preserve"> where the ST_Intersects integrity gate rejects duplicate and overlapping claims on arrival.</w:t>
+      </w:r>
     </w:p>
     <w:p>
       <w:pPr>
@@ -9512,7 +9699,36 @@
           <w:szCs w:val="21"/>
           <w:rtl w:val="0"/>
         </w:rPr>
-        <w:t xml:space="preserve">  PostGIS integrity gate: ST_Intersects rejects duplicate and overlapping claims on arrival.</w:t>
+        <w:t xml:space="preserve">  AI engine gathers satellite evidence (Whisp primary; GFW independent track)</w:t>
+      </w:r>
+      <w:r>
+        <w:rPr>
+          <w:rFonts w:ascii="Times New Roman" w:cs="Times New Roman" w:eastAsia="Times New Roman" w:hAnsi="Times New Roman"/>
+          <w:sz w:val="21"/>
+          <w:szCs w:val="21"/>
+          <w:vertAlign w:val="superscript"/>
+          <w:rtl w:val="0"/>
+        </w:rPr>
+        <w:t xml:space="preserve">6,7</w:t>
+      </w:r>
+      <w:r>
+        <w:rPr>
+          <w:rFonts w:ascii="Times New Roman" w:cs="Times New Roman" w:eastAsia="Times New Roman" w:hAnsi="Times New Roman"/>
+          <w:sz w:val="21"/>
+          <w:szCs w:val="21"/>
+          <w:rtl w:val="0"/>
+        </w:rPr>
+        <w:t xml:space="preserve"> and Gemini writes the Bahasa verdict.</w:t>
+      </w:r>
+      <w:r>
+        <w:rPr>
+          <w:rFonts w:ascii="Times New Roman" w:cs="Times New Roman" w:eastAsia="Times New Roman" w:hAnsi="Times New Roman"/>
+          <w:sz w:val="21"/>
+          <w:szCs w:val="21"/>
+          <w:vertAlign w:val="superscript"/>
+          <w:rtl w:val="0"/>
+        </w:rPr>
+        <w:t xml:space="preserve">31</w:t>
       </w:r>
     </w:p>
     <w:p>
@@ -9615,36 +9831,7 @@
           <w:szCs w:val="21"/>
           <w:rtl w:val="0"/>
         </w:rPr>
-        <w:t xml:space="preserve">  AI engine gathers satellite evidence (Whisp primary; GFW independent track)</w:t>
-      </w:r>
-      <w:r>
-        <w:rPr>
-          <w:rFonts w:ascii="Times New Roman" w:cs="Times New Roman" w:eastAsia="Times New Roman" w:hAnsi="Times New Roman"/>
-          <w:sz w:val="21"/>
-          <w:szCs w:val="21"/>
-          <w:vertAlign w:val="superscript"/>
-          <w:rtl w:val="0"/>
-        </w:rPr>
-        <w:t xml:space="preserve">6,7</w:t>
-      </w:r>
-      <w:r>
-        <w:rPr>
-          <w:rFonts w:ascii="Times New Roman" w:cs="Times New Roman" w:eastAsia="Times New Roman" w:hAnsi="Times New Roman"/>
-          <w:sz w:val="21"/>
-          <w:szCs w:val="21"/>
-          <w:rtl w:val="0"/>
-        </w:rPr>
-        <w:t xml:space="preserve"> and Gemini writes the Bahasa verdict.</w:t>
-      </w:r>
-      <w:r>
-        <w:rPr>
-          <w:rFonts w:ascii="Times New Roman" w:cs="Times New Roman" w:eastAsia="Times New Roman" w:hAnsi="Times New Roman"/>
-          <w:sz w:val="21"/>
-          <w:szCs w:val="21"/>
-          <w:vertAlign w:val="superscript"/>
-          <w:rtl w:val="0"/>
-        </w:rPr>
-        <w:t xml:space="preserve">31</w:t>
+        <w:t xml:space="preserve">  Bundle hashes batch into a Merkle tree — thousands of plots, one 32-byte root.</w:t>
       </w:r>
     </w:p>
     <w:p>
@@ -9675,7 +9862,7 @@
           <w:szCs w:val="21"/>
           <w:rtl w:val="0"/>
         </w:rPr>
-        <w:t xml:space="preserve">  Bundle hashes batch into a Merkle root, anchored by TandaRegistry.sol on Polygon.</w:t>
+        <w:t xml:space="preserve">  The root is anchored by TandaRegistry.sol on Polygon; the event is public forever.</w:t>
       </w:r>
       <w:r>
         <w:rPr>

</xml_diff>

<commit_message>
Revise per adversarial due-diligence: fix magnitude claims, volume-plausibility gate, PDP/GDPR treatment, GPS canopy honesty, cost harmonization
Co-Authored-By: Claude Fable 5 <noreply@anthropic.com>
Claude-Session: https://claude.ai/code/session_01BRbN1conQ6WbT1TXRrNhHs
</commit_message>
<xml_diff>
--- a/hacksphere-2026/proposal/ROOT ACCESS-TANDATANI-INTL.docx
+++ b/hacksphere-2026/proposal/ROOT ACCESS-TANDATANI-INTL.docx
@@ -2097,7 +2097,7 @@
           <w:szCs w:val="22"/>
           <w:rtl w:val="0"/>
         </w:rPr>
-        <w:t xml:space="preserve">Farmers pay nothing; exporters pay per shipment — two orders of magnitude below today’s €800-per-day consultants</w:t>
+        <w:t xml:space="preserve">Farmers pay nothing; exporters pay per shipment — less than 6% of a single consultant-day at today’s €800–1,500 rates</w:t>
       </w:r>
       <w:r>
         <w:rPr>
@@ -2443,7 +2443,26 @@
           <w:szCs w:val="22"/>
           <w:rtl w:val="0"/>
         </w:rPr>
-        <w:t xml:space="preserve"> — meaning real checks on 3% of operators, not a waiver.</w:t>
+        <w:t xml:space="preserve"> — 3% of operators face ex-post audits, but a valid DDS reference is a customs precondition for </w:t>
+      </w:r>
+      <w:r>
+        <w:rPr>
+          <w:rFonts w:ascii="Times New Roman" w:cs="Times New Roman" w:eastAsia="Times New Roman" w:hAnsi="Times New Roman"/>
+          <w:sz w:val="22"/>
+          <w:szCs w:val="22"/>
+          <w:i w:val="1"/>
+          <w:rtl w:val="0"/>
+        </w:rPr>
+        <w:t xml:space="preserve">every</w:t>
+      </w:r>
+      <w:r>
+        <w:rPr>
+          <w:rFonts w:ascii="Times New Roman" w:cs="Times New Roman" w:eastAsia="Times New Roman" w:hAnsi="Times New Roman"/>
+          <w:sz w:val="22"/>
+          <w:szCs w:val="22"/>
+          <w:rtl w:val="0"/>
+        </w:rPr>
+        <w:t xml:space="preserve"> shipment, and buyers facing the fines push the data burden upstream regardless.</w:t>
       </w:r>
       <w:r>
         <w:rPr>
@@ -2670,7 +2689,7 @@
                 <w:color w:val="4a4a4a"/>
                 <w:rtl w:val="0"/>
               </w:rPr>
-              <w:t xml:space="preserve">of Indonesian coffee is grown by smallholders on 0.5–2 ha plots</w:t>
+              <w:t xml:space="preserve">of Indonesian coffee production comes from smallholders on 0.5–2 ha plots</w:t>
             </w:r>
             <w:r>
               <w:rPr>
@@ -2722,7 +2741,7 @@
                 <w:color w:val="4a4a4a"/>
                 <w:rtl w:val="0"/>
               </w:rPr>
-              <w:t xml:space="preserve">of coffee farmers hold e-STDB — the registration that doubles as their geolocation record</w:t>
+              <w:t xml:space="preserve">of coffee farmers hold e-STDB — the registration that doubles as their geolocation record (MoA, 2024)</w:t>
             </w:r>
             <w:r>
               <w:rPr>
@@ -2998,7 +3017,7 @@
           <w:szCs w:val="22"/>
           <w:rtl w:val="0"/>
         </w:rPr>
-        <w:t xml:space="preserve"> (Ministry of Agriculture data).</w:t>
+        <w:t xml:space="preserve"> (Ministry of Agriculture data, July 2024 — the latest published breakdown).</w:t>
       </w:r>
       <w:r>
         <w:rPr>
@@ -3558,7 +3577,7 @@
           <w:szCs w:val="22"/>
           <w:rtl w:val="0"/>
         </w:rPr>
-        <w:t xml:space="preserve"> of Indonesia’s 28.2 M farmers use any digital technology;</w:t>
+        <w:t xml:space="preserve"> of Indonesia’s 28.2 M farmers use modern machinery or digital technology;</w:t>
       </w:r>
       <w:r>
         <w:rPr>
@@ -4606,7 +4625,45 @@
           <w:szCs w:val="22"/>
           <w:rtl w:val="0"/>
         </w:rPr>
-        <w:t xml:space="preserve">.</w:t>
+        <w:t xml:space="preserve"> — a signature proves </w:t>
+      </w:r>
+      <w:r>
+        <w:rPr>
+          <w:rFonts w:ascii="Times New Roman" w:cs="Times New Roman" w:eastAsia="Times New Roman" w:hAnsi="Times New Roman"/>
+          <w:sz w:val="22"/>
+          <w:szCs w:val="22"/>
+          <w:i w:val="1"/>
+          <w:rtl w:val="0"/>
+        </w:rPr>
+        <w:t xml:space="preserve">who</w:t>
+      </w:r>
+      <w:r>
+        <w:rPr>
+          <w:rFonts w:ascii="Times New Roman" w:cs="Times New Roman" w:eastAsia="Times New Roman" w:hAnsi="Times New Roman"/>
+          <w:sz w:val="22"/>
+          <w:szCs w:val="22"/>
+          <w:rtl w:val="0"/>
+        </w:rPr>
+        <w:t xml:space="preserve"> wrote a record, the anchor proves </w:t>
+      </w:r>
+      <w:r>
+        <w:rPr>
+          <w:rFonts w:ascii="Times New Roman" w:cs="Times New Roman" w:eastAsia="Times New Roman" w:hAnsi="Times New Roman"/>
+          <w:sz w:val="22"/>
+          <w:szCs w:val="22"/>
+          <w:i w:val="1"/>
+          <w:rtl w:val="0"/>
+        </w:rPr>
+        <w:t xml:space="preserve">when</w:t>
+      </w:r>
+      <w:r>
+        <w:rPr>
+          <w:rFonts w:ascii="Times New Roman" w:cs="Times New Roman" w:eastAsia="Times New Roman" w:hAnsi="Times New Roman"/>
+          <w:sz w:val="22"/>
+          <w:szCs w:val="22"/>
+          <w:rtl w:val="0"/>
+        </w:rPr>
+        <w:t xml:space="preserve">, so no issuer can quietly backdate a passport after a deforestation alert lands.</w:t>
       </w:r>
     </w:p>
     <w:p>
@@ -5644,7 +5701,7 @@
                 <w:szCs w:val="18"/>
                 <w:rtl w:val="0"/>
               </w:rPr>
-              <w:t xml:space="preserve">Analysis and filing exist — identity, credentials, chain of custody, offline Bahasa UX do not</w:t>
+              <w:t xml:space="preserve">Analysis and filing exist — identity, attestations, volume-bounded dossiers, offline Bahasa capture and portable credentials do not</w:t>
             </w:r>
           </w:p>
         </w:tc>
@@ -5870,7 +5927,7 @@
           <w:szCs w:val="22"/>
           <w:rtl w:val="0"/>
         </w:rPr>
-        <w:t xml:space="preserve"> smartphone GPS is accurate to ≤ 4.9 m in open sky</w:t>
+        <w:t xml:space="preserve"> smartphone GPS reaches ≤ 4.9 m in open sky</w:t>
       </w:r>
       <w:r>
         <w:rPr>
@@ -5889,7 +5946,7 @@
           <w:szCs w:val="22"/>
           <w:rtl w:val="0"/>
         </w:rPr>
-        <w:t xml:space="preserve">) or walk-the-boundary polygon capture above 4 ha, over Esri satellite imagery (MapLibre GL). Farmer profile, plot photos, harvest estimate. Captures queue in IndexedDB and sync when signal returns — demonstrated live in airplane mode.</w:t>
+        <w:t xml:space="preserve">, and under shade canopy Ladang shows live accuracy, accepting a point only below a 10 m threshold with tap-on-imagery fallback) or walk-the-boundary polygon capture above 4 ha, over Esri satellite imagery (MapLibre GL). Farmer profile, plot photos, harvest estimate. Captures queue in IndexedDB and sync when signal returns — demonstrated live in airplane mode.</w:t>
       </w:r>
     </w:p>
     <w:p>
@@ -6293,7 +6350,26 @@
           <w:szCs w:val="22"/>
           <w:rtl w:val="0"/>
         </w:rPr>
-        <w:t xml:space="preserve">) plus a QR-stamped evidence-summary PDF. An append-only audit log shows every state change behind the dossier.</w:t>
+        <w:t xml:space="preserve">) plus a QR-stamped evidence-summary PDF. A </w:t>
+      </w:r>
+      <w:r>
+        <w:rPr>
+          <w:rFonts w:ascii="Times New Roman" w:cs="Times New Roman" w:eastAsia="Times New Roman" w:hAnsi="Times New Roman"/>
+          <w:sz w:val="22"/>
+          <w:szCs w:val="22"/>
+          <w:b w:val="1"/>
+          <w:rtl w:val="0"/>
+        </w:rPr>
+        <w:t xml:space="preserve">volume-plausibility gate</w:t>
+      </w:r>
+      <w:r>
+        <w:rPr>
+          <w:rFonts w:ascii="Times New Roman" w:cs="Times New Roman" w:eastAsia="Times New Roman" w:hAnsi="Times New Roman"/>
+          <w:sz w:val="22"/>
+          <w:szCs w:val="22"/>
+          <w:rtl w:val="0"/>
+        </w:rPr>
+        <w:t xml:space="preserve"> blocks any dossier whose tonnage exceeds the summed harvest estimates of its passports — the launderer’s math stops working — and an append-only audit log shows every state change behind it.</w:t>
       </w:r>
     </w:p>
     <w:p>
@@ -7196,6 +7272,15 @@
         </w:rPr>
         <w:t xml:space="preserve">Cut-not-fake rule: if a feature slips, we cut it — we never simulate it.</w:t>
       </w:r>
+      <w:r>
+        <w:rPr>
+          <w:rFonts w:ascii="Times New Roman" w:cs="Times New Roman" w:eastAsia="Times New Roman" w:hAnsi="Times New Roman"/>
+          <w:sz w:val="22"/>
+          <w:szCs w:val="22"/>
+          <w:rtl w:val="0"/>
+        </w:rPr>
+        <w:t xml:space="preserve"> Declared cut order if time slips: the Tanya Tani copilot goes first, the PDF dossier second (the TRACES GeoJSON remains), Exporter Studio polish third — the capture → verify → issue → publicly-verify loop (Features 1–4) is the non-negotiable demo core.</w:t>
+      </w:r>
     </w:p>
     <w:p>
       <w:pPr>
@@ -7306,7 +7391,7 @@
           <w:szCs w:val="22"/>
           <w:rtl w:val="0"/>
         </w:rPr>
-        <w:t xml:space="preserve"> in Indonesia’s Arabica belt: specifically the Gayo highlands (Aceh Tengah, Bener Meriah, Gayo Lues), home to Southeast Asia’s largest Arabica area, an EU Geographical Indication since 2010, and cooperatives like women-led </w:t>
+        <w:t xml:space="preserve"> in Indonesia’s Arabica belt: specifically the Gayo highlands (Aceh Tengah, Bener Meriah, Gayo Lues), home to Southeast Asia’s largest Arabica area, a protected Geographical Indication origin since 2010, and cooperatives like women-led </w:t>
       </w:r>
       <w:r>
         <w:rPr>
@@ -7464,6 +7549,78 @@
           <w:ilvl w:val="0"/>
           <w:numId w:val="50"/>
         </w:numPr>
+        <w:spacing w:after="60" w:before="0" w:line="276" w:lineRule="auto"/>
+        <w:ind w:left="1080" w:hanging="216"/>
+        <w:rPr>
+          <w:rFonts w:ascii="Times New Roman" w:cs="Times New Roman" w:eastAsia="Times New Roman" w:hAnsi="Times New Roman"/>
+          <w:sz w:val="22"/>
+          <w:szCs w:val="22"/>
+        </w:rPr>
+      </w:pPr>
+      <w:r>
+        <w:rPr>
+          <w:rFonts w:ascii="Times New Roman" w:cs="Times New Roman" w:eastAsia="Times New Roman" w:hAnsi="Times New Roman"/>
+          <w:sz w:val="22"/>
+          <w:szCs w:val="22"/>
+          <w:b w:val="1"/>
+          <w:rtl w:val="0"/>
+        </w:rPr>
+        <w:t xml:space="preserve">Secondary (year 1–2)</w:t>
+      </w:r>
+      <w:r>
+        <w:rPr>
+          <w:rFonts w:ascii="Times New Roman" w:cs="Times New Roman" w:eastAsia="Times New Roman" w:hAnsi="Times New Roman"/>
+          <w:sz w:val="22"/>
+          <w:szCs w:val="22"/>
+          <w:rtl w:val="0"/>
+        </w:rPr>
+        <w:t xml:space="preserve"> — cocoa and rubber cooperatives (0.00% and 0.03% e-STDB coverage</w:t>
+      </w:r>
+      <w:r>
+        <w:rPr>
+          <w:rFonts w:ascii="Times New Roman" w:cs="Times New Roman" w:eastAsia="Times New Roman" w:hAnsi="Times New Roman"/>
+          <w:sz w:val="22"/>
+          <w:szCs w:val="22"/>
+          <w:vertAlign w:val="superscript"/>
+          <w:rtl w:val="0"/>
+        </w:rPr>
+        <w:t xml:space="preserve">5</w:t>
+      </w:r>
+      <w:r>
+        <w:rPr>
+          <w:rFonts w:ascii="Times New Roman" w:cs="Times New Roman" w:eastAsia="Times New Roman" w:hAnsi="Times New Roman"/>
+          <w:sz w:val="22"/>
+          <w:szCs w:val="22"/>
+          <w:rtl w:val="0"/>
+        </w:rPr>
+        <w:t xml:space="preserve">), then independent palm smallholder associations; </w:t>
+      </w:r>
+      <w:r>
+        <w:rPr>
+          <w:rFonts w:ascii="Times New Roman" w:cs="Times New Roman" w:eastAsia="Times New Roman" w:hAnsi="Times New Roman"/>
+          <w:sz w:val="22"/>
+          <w:szCs w:val="22"/>
+          <w:b w:val="1"/>
+          <w:rtl w:val="0"/>
+        </w:rPr>
+        <w:t xml:space="preserve">EU importers</w:t>
+      </w:r>
+      <w:r>
+        <w:rPr>
+          <w:rFonts w:ascii="Times New Roman" w:cs="Times New Roman" w:eastAsia="Times New Roman" w:hAnsi="Times New Roman"/>
+          <w:sz w:val="22"/>
+          <w:szCs w:val="22"/>
+          <w:rtl w:val="0"/>
+        </w:rPr>
+        <w:t xml:space="preserve"> who verify passports (free) and later pay for API access.</w:t>
+      </w:r>
+    </w:p>
+    <w:p>
+      <w:pPr>
+        <w:numPr>
+          <w:ilvl w:val="0"/>
+          <w:numId w:val="50"/>
+        </w:numPr>
         <w:spacing w:after="120" w:before="0" w:line="276" w:lineRule="auto"/>
         <w:ind w:left="1080" w:hanging="216"/>
         <w:rPr>
@@ -7480,54 +7637,16 @@
           <w:b w:val="1"/>
           <w:rtl w:val="0"/>
         </w:rPr>
-        <w:t xml:space="preserve">Secondary (year 1–2)</w:t>
-      </w:r>
-      <w:r>
-        <w:rPr>
-          <w:rFonts w:ascii="Times New Roman" w:cs="Times New Roman" w:eastAsia="Times New Roman" w:hAnsi="Times New Roman"/>
-          <w:sz w:val="22"/>
-          <w:szCs w:val="22"/>
-          <w:rtl w:val="0"/>
-        </w:rPr>
-        <w:t xml:space="preserve"> — cocoa and rubber cooperatives (0.00% and 0.03% e-STDB coverage</w:t>
-      </w:r>
-      <w:r>
-        <w:rPr>
-          <w:rFonts w:ascii="Times New Roman" w:cs="Times New Roman" w:eastAsia="Times New Roman" w:hAnsi="Times New Roman"/>
-          <w:sz w:val="22"/>
-          <w:szCs w:val="22"/>
-          <w:vertAlign w:val="superscript"/>
-          <w:rtl w:val="0"/>
-        </w:rPr>
-        <w:t xml:space="preserve">5</w:t>
-      </w:r>
-      <w:r>
-        <w:rPr>
-          <w:rFonts w:ascii="Times New Roman" w:cs="Times New Roman" w:eastAsia="Times New Roman" w:hAnsi="Times New Roman"/>
-          <w:sz w:val="22"/>
-          <w:szCs w:val="22"/>
-          <w:rtl w:val="0"/>
-        </w:rPr>
-        <w:t xml:space="preserve">), then independent palm smallholder associations; </w:t>
-      </w:r>
-      <w:r>
-        <w:rPr>
-          <w:rFonts w:ascii="Times New Roman" w:cs="Times New Roman" w:eastAsia="Times New Roman" w:hAnsi="Times New Roman"/>
-          <w:sz w:val="22"/>
-          <w:szCs w:val="22"/>
-          <w:b w:val="1"/>
-          <w:rtl w:val="0"/>
-        </w:rPr>
-        <w:t xml:space="preserve">EU importers</w:t>
-      </w:r>
-      <w:r>
-        <w:rPr>
-          <w:rFonts w:ascii="Times New Roman" w:cs="Times New Roman" w:eastAsia="Times New Roman" w:hAnsi="Times New Roman"/>
-          <w:sz w:val="22"/>
-          <w:szCs w:val="22"/>
-          <w:rtl w:val="0"/>
-        </w:rPr>
-        <w:t xml:space="preserve"> who verify passports (free) and later pay for API access.</w:t>
+        <w:t xml:space="preserve">Validation, honestly stated:</w:t>
+      </w:r>
+      <w:r>
+        <w:rPr>
+          <w:rFonts w:ascii="Times New Roman" w:cs="Times New Roman" w:eastAsia="Times New Roman" w:hAnsi="Times New Roman"/>
+          <w:sz w:val="22"/>
+          <w:szCs w:val="22"/>
+          <w:rtl w:val="0"/>
+        </w:rPr>
+        <w:t xml:space="preserve"> we have not yet interviewed a customer. Between this submission and the final we will hold structured calls with Gayo cooperative officers (intro path: the WRI Sustainable Gayo Coffee network and Fairtrade producer support) to test willingness-to-pay — and we will report what we hear, including bad news, on stage.</w:t>
       </w:r>
     </w:p>
     <w:p>
@@ -8167,7 +8286,7 @@
           <w:szCs w:val="22"/>
           <w:rtl w:val="0"/>
         </w:rPr>
-        <w:t xml:space="preserve"> for the credential registry and Fairtrade/e-STDB exports — less than 1% of a certification’s per-farmer cost.</w:t>
+        <w:t xml:space="preserve"> for the credential registry and Fairtrade/e-STDB exports — less than 1% of a certification’s per-farmer cost;</w:t>
       </w:r>
       <w:r>
         <w:rPr>
@@ -8178,6 +8297,15 @@
           <w:rtl w:val="0"/>
         </w:rPr>
         <w:t xml:space="preserve">23</w:t>
+      </w:r>
+      <w:r>
+        <w:rPr>
+          <w:rFonts w:ascii="Times New Roman" w:cs="Times New Roman" w:eastAsia="Times New Roman" w:hAnsi="Times New Roman"/>
+          <w:sz w:val="22"/>
+          <w:szCs w:val="22"/>
+          <w:rtl w:val="0"/>
+        </w:rPr>
+        <w:t xml:space="preserve"> a member visit takes minutes, and one visit now serves EUDR, Fairtrade and e-STDB at once.</w:t>
       </w:r>
     </w:p>
     <w:p>
@@ -8290,7 +8418,7 @@
           <w:szCs w:val="22"/>
           <w:rtl w:val="0"/>
         </w:rPr>
-        <w:t xml:space="preserve"> Marginal cost per verified plot ≈ $0.002 LLM + $0.00001 anchoring + fractions of a cent of storage</w:t>
+        <w:t xml:space="preserve"> Marginal cost per verified plot ≈ $0.002 LLM + anchoring amortized to ≈$0.000001 in 1,000-plot batches + fractions of a cent of storage</w:t>
       </w:r>
       <w:r>
         <w:rPr>
@@ -8881,7 +9009,7 @@
                 <w:szCs w:val="17"/>
                 <w:rtl w:val="0"/>
               </w:rPr>
-              <w:t xml:space="preserve">Farmer digital literacy (46.8% digital adoption</w:t>
+              <w:t xml:space="preserve">Farmer digital literacy (46.8% modern-tech adoption</w:t>
             </w:r>
             <w:r>
               <w:rPr>
@@ -9072,7 +9200,26 @@
                 <w:szCs w:val="17"/>
                 <w:rtl w:val="0"/>
               </w:rPr>
-              <w:t xml:space="preserve">Passports also serve Fairtrade Jan-2027, e-STDB, ISPO and buyer programs — the wall has many bricks</w:t>
+              <w:t xml:space="preserve">The 2024 delay itself triggered +72% buyer front-loading — buyers, not Brussels, now enforce;</w:t>
+            </w:r>
+            <w:r>
+              <w:rPr>
+                <w:rFonts w:ascii="Times New Roman" w:cs="Times New Roman" w:eastAsia="Times New Roman" w:hAnsi="Times New Roman"/>
+                <w:sz w:val="17"/>
+                <w:szCs w:val="17"/>
+                <w:vertAlign w:val="superscript"/>
+                <w:rtl w:val="0"/>
+              </w:rPr>
+              <w:t xml:space="preserve">28</w:t>
+            </w:r>
+            <w:r>
+              <w:rPr>
+                <w:rFonts w:ascii="Times New Roman" w:cs="Times New Roman" w:eastAsia="Times New Roman" w:hAnsi="Times New Roman"/>
+                <w:sz w:val="17"/>
+                <w:szCs w:val="17"/>
+                <w:rtl w:val="0"/>
+              </w:rPr>
+              <w:t xml:space="preserve"> passports also serve Fairtrade Jan-2027, e-STDB and ISPO</w:t>
             </w:r>
             <w:r>
               <w:rPr>
@@ -9278,7 +9425,7 @@
                 <w:szCs w:val="17"/>
                 <w:rtl w:val="0"/>
               </w:rPr>
-              <w:t xml:space="preserve">Key rotation + re-issuance; credential status registry; custody handbook (roadmap: social recovery)</w:t>
+              <w:t xml:space="preserve">Credential-status registry + re-issuance under a successor DID (did:key is single-keypair by design; roadmap: did:web for true rotation)</w:t>
             </w:r>
           </w:p>
         </w:tc>
@@ -10773,6 +10920,40 @@
           <w:ilvl w:val="0"/>
           <w:numId w:val="50"/>
         </w:numPr>
+        <w:spacing w:after="60" w:before="0" w:line="276" w:lineRule="auto"/>
+        <w:ind w:left="1080" w:hanging="216"/>
+        <w:rPr>
+          <w:rFonts w:ascii="Times New Roman" w:cs="Times New Roman" w:eastAsia="Times New Roman" w:hAnsi="Times New Roman"/>
+          <w:sz w:val="22"/>
+          <w:szCs w:val="22"/>
+        </w:rPr>
+      </w:pPr>
+      <w:r>
+        <w:rPr>
+          <w:rFonts w:ascii="Times New Roman" w:cs="Times New Roman" w:eastAsia="Times New Roman" w:hAnsi="Times New Roman"/>
+          <w:sz w:val="22"/>
+          <w:szCs w:val="22"/>
+          <w:b w:val="1"/>
+          <w:rtl w:val="0"/>
+        </w:rPr>
+        <w:t xml:space="preserve">Keys:</w:t>
+      </w:r>
+      <w:r>
+        <w:rPr>
+          <w:rFonts w:ascii="Times New Roman" w:cs="Times New Roman" w:eastAsia="Times New Roman" w:hAnsi="Times New Roman"/>
+          <w:sz w:val="22"/>
+          <w:szCs w:val="22"/>
+          <w:rtl w:val="0"/>
+        </w:rPr>
+        <w:t xml:space="preserve"> cooperatives hold did:key signing keys; exporters authenticate by wallet (SIWE); a relayer pays gas so farmers never see crypto.</w:t>
+      </w:r>
+    </w:p>
+    <w:p>
+      <w:pPr>
+        <w:numPr>
+          <w:ilvl w:val="0"/>
+          <w:numId w:val="50"/>
+        </w:numPr>
         <w:spacing w:after="120" w:before="0" w:line="276" w:lineRule="auto"/>
         <w:ind w:left="1080" w:hanging="216"/>
         <w:rPr>
@@ -10789,16 +10970,16 @@
           <w:b w:val="1"/>
           <w:rtl w:val="0"/>
         </w:rPr>
-        <w:t xml:space="preserve">Keys:</w:t>
-      </w:r>
-      <w:r>
-        <w:rPr>
-          <w:rFonts w:ascii="Times New Roman" w:cs="Times New Roman" w:eastAsia="Times New Roman" w:hAnsi="Times New Roman"/>
-          <w:sz w:val="22"/>
-          <w:szCs w:val="22"/>
-          <w:rtl w:val="0"/>
-        </w:rPr>
-        <w:t xml:space="preserve"> cooperatives hold did:key signing keys; exporters authenticate by wallet (SIWE); a relayer pays gas so farmers never see crypto.</w:t>
+        <w:t xml:space="preserve">Privacy law, named.</w:t>
+      </w:r>
+      <w:r>
+        <w:rPr>
+          <w:rFonts w:ascii="Times New Roman" w:cs="Times New Roman" w:eastAsia="Times New Roman" w:hAnsi="Times New Roman"/>
+          <w:sz w:val="22"/>
+          <w:szCs w:val="22"/>
+          <w:rtl w:val="0"/>
+        </w:rPr>
+        <w:t xml:space="preserve"> Indonesia’s PDP Law (UU 27/2022) and the GDPR shape the design: consent captured at enrollment (the cooperative as data controller, TandaTani as processor), coordinates under row-level security and disclosed only inside the DDS, credential copies on the farmer’s device and printable QR card — and, because the chain holds only salted hashes, destroying a record’s salt is a clean erasure path. The public QR page shows a verdict, never coordinates or identities.</w:t>
       </w:r>
     </w:p>
     <w:p>
@@ -10924,7 +11105,7 @@
           <w:szCs w:val="22"/>
           <w:rtl w:val="0"/>
         </w:rPr>
-        <w:t xml:space="preserve">) exceed demo load ≈50×; Groq is wired behind the same interface.</w:t>
+        <w:t xml:space="preserve">) comfortably exceed rehearsal-measured demo load; Groq is wired behind the same interface.</w:t>
       </w:r>
     </w:p>
     <w:p>

</xml_diff>

<commit_message>
Final revision: judge round-2 fixes — API bus topology, chip corrections, full-page rotated figure, custody harmony, gate reconciliation, placeholder labels
Score progression: 78.8 → 84.3 (round 2, verified); all 17 punch-list items applied.

Co-Authored-By: Claude Fable 5 <noreply@anthropic.com>
Claude-Session: https://claude.ai/code/session_01BRbN1conQ6WbT1TXRrNhHs
</commit_message>
<xml_diff>
--- a/hacksphere-2026/proposal/ROOT ACCESS-TANDATANI-INTL.docx
+++ b/hacksphere-2026/proposal/ROOT ACCESS-TANDATANI-INTL.docx
@@ -805,7 +805,7 @@
                 <w:rFonts w:ascii="Times New Roman" w:cs="Times New Roman" w:eastAsia="Times New Roman" w:hAnsi="Times New Roman"/>
                 <w:rtl w:val="0"/>
               </w:rPr>
-              <w:t xml:space="preserve">‹institution — fill before export›</w:t>
+              <w:t xml:space="preserve">‹leader: institution›</w:t>
             </w:r>
           </w:p>
         </w:tc>
@@ -914,7 +914,7 @@
                 <w:rFonts w:ascii="Times New Roman" w:cs="Times New Roman" w:eastAsia="Times New Roman" w:hAnsi="Times New Roman"/>
                 <w:rtl w:val="0"/>
               </w:rPr>
-              <w:t xml:space="preserve">‹member 2 name›</w:t>
+              <w:t xml:space="preserve">‹Member 1: full name›</w:t>
             </w:r>
           </w:p>
         </w:tc>
@@ -1056,7 +1056,7 @@
                 <w:rFonts w:ascii="Times New Roman" w:cs="Times New Roman" w:eastAsia="Times New Roman" w:hAnsi="Times New Roman"/>
                 <w:rtl w:val="0"/>
               </w:rPr>
-              <w:t xml:space="preserve">‹member 2 email›</w:t>
+              <w:t xml:space="preserve">‹Member 1: email›</w:t>
             </w:r>
           </w:p>
         </w:tc>
@@ -1125,7 +1125,7 @@
                 <w:rFonts w:ascii="Times New Roman" w:cs="Times New Roman" w:eastAsia="Times New Roman" w:hAnsi="Times New Roman"/>
                 <w:rtl w:val="0"/>
               </w:rPr>
-              <w:t xml:space="preserve">‹member 2 country›</w:t>
+              <w:t xml:space="preserve">‹Member 1: country›</w:t>
             </w:r>
           </w:p>
         </w:tc>
@@ -1194,7 +1194,7 @@
                 <w:rFonts w:ascii="Times New Roman" w:cs="Times New Roman" w:eastAsia="Times New Roman" w:hAnsi="Times New Roman"/>
                 <w:rtl w:val="0"/>
               </w:rPr>
-              <w:t xml:space="preserve">‹member 2 institution›</w:t>
+              <w:t xml:space="preserve">‹Member 1: institution›</w:t>
             </w:r>
           </w:p>
         </w:tc>
@@ -1303,7 +1303,7 @@
                 <w:rFonts w:ascii="Times New Roman" w:cs="Times New Roman" w:eastAsia="Times New Roman" w:hAnsi="Times New Roman"/>
                 <w:rtl w:val="0"/>
               </w:rPr>
-              <w:t xml:space="preserve">‹member 3 name›</w:t>
+              <w:t xml:space="preserve">‹Member 2: full name›</w:t>
             </w:r>
           </w:p>
         </w:tc>
@@ -1445,7 +1445,7 @@
                 <w:rFonts w:ascii="Times New Roman" w:cs="Times New Roman" w:eastAsia="Times New Roman" w:hAnsi="Times New Roman"/>
                 <w:rtl w:val="0"/>
               </w:rPr>
-              <w:t xml:space="preserve">‹member 3 email›</w:t>
+              <w:t xml:space="preserve">‹Member 2: email›</w:t>
             </w:r>
           </w:p>
         </w:tc>
@@ -1514,7 +1514,7 @@
                 <w:rFonts w:ascii="Times New Roman" w:cs="Times New Roman" w:eastAsia="Times New Roman" w:hAnsi="Times New Roman"/>
                 <w:rtl w:val="0"/>
               </w:rPr>
-              <w:t xml:space="preserve">‹member 3 country›</w:t>
+              <w:t xml:space="preserve">‹Member 2: country›</w:t>
             </w:r>
           </w:p>
         </w:tc>
@@ -1583,7 +1583,7 @@
                 <w:rFonts w:ascii="Times New Roman" w:cs="Times New Roman" w:eastAsia="Times New Roman" w:hAnsi="Times New Roman"/>
                 <w:rtl w:val="0"/>
               </w:rPr>
-              <w:t xml:space="preserve">‹member 3 institution›</w:t>
+              <w:t xml:space="preserve">‹Member 2: institution›</w:t>
             </w:r>
           </w:p>
         </w:tc>
@@ -4211,7 +4211,26 @@
           <w:szCs w:val="22"/>
           <w:rtl w:val="0"/>
         </w:rPr>
-        <w:t xml:space="preserve"> The passport is a signed credential held for the farmer — not locked in our database. If the farmer changes buyer or platform, or if TandaTani itself disappears, the proof stays valid and verifiable. No incumbent offers this; their records live in the paying client’s silo.</w:t>
+        <w:t xml:space="preserve"> The passport downloads as a self-contained signed file — the credential, its evidence hashes and its Merkle proof, plus a printable QR card — </w:t>
+      </w:r>
+      <w:r>
+        <w:rPr>
+          <w:rFonts w:ascii="Times New Roman" w:cs="Times New Roman" w:eastAsia="Times New Roman" w:hAnsi="Times New Roman"/>
+          <w:sz w:val="22"/>
+          <w:szCs w:val="22"/>
+          <w:b w:val="1"/>
+          <w:rtl w:val="0"/>
+        </w:rPr>
+        <w:t xml:space="preserve">held by the farmer</w:t>
+      </w:r>
+      <w:r>
+        <w:rPr>
+          <w:rFonts w:ascii="Times New Roman" w:cs="Times New Roman" w:eastAsia="Times New Roman" w:hAnsi="Times New Roman"/>
+          <w:sz w:val="22"/>
+          <w:szCs w:val="22"/>
+          <w:rtl w:val="0"/>
+        </w:rPr>
+        <w:t xml:space="preserve"> on their own device, with cooperative custody as the fallback, never locked in our database. Verifying it needs only that file and the public chain: if the farmer changes buyer or platform, or if TandaTani itself disappears, the proof still verifies. None of the major incumbents offers this; their records live in the paying client’s silo.</w:t>
       </w:r>
       <w:r>
         <w:rPr>
@@ -5050,6 +5069,9 @@
         <w:gridCol w:w="3049"/>
       </w:tblGrid>
       <w:tr>
+        <w:trPr>
+          <w:cantSplit w:val="1"/>
+        </w:trPr>
         <w:tc>
           <w:tcPr>
             <w:tcW w:w="2760" w:type="dxa"/>
@@ -5157,6 +5179,9 @@
         </w:tc>
       </w:tr>
       <w:tr>
+        <w:trPr>
+          <w:cantSplit w:val="1"/>
+        </w:trPr>
         <w:tc>
           <w:tcPr>
             <w:tcW w:w="2760" w:type="dxa"/>
@@ -5275,6 +5300,9 @@
         </w:tc>
       </w:tr>
       <w:tr>
+        <w:trPr>
+          <w:cantSplit w:val="1"/>
+        </w:trPr>
         <w:tc>
           <w:tcPr>
             <w:tcW w:w="2760" w:type="dxa"/>
@@ -5383,6 +5411,9 @@
         </w:tc>
       </w:tr>
       <w:tr>
+        <w:trPr>
+          <w:cantSplit w:val="1"/>
+        </w:trPr>
         <w:tc>
           <w:tcPr>
             <w:tcW w:w="2760" w:type="dxa"/>
@@ -5491,6 +5522,9 @@
         </w:tc>
       </w:tr>
       <w:tr>
+        <w:trPr>
+          <w:cantSplit w:val="1"/>
+        </w:trPr>
         <w:tc>
           <w:tcPr>
             <w:tcW w:w="2760" w:type="dxa"/>
@@ -5599,6 +5633,9 @@
         </w:tc>
       </w:tr>
       <w:tr>
+        <w:trPr>
+          <w:cantSplit w:val="1"/>
+        </w:trPr>
         <w:tc>
           <w:tcPr>
             <w:tcW w:w="2760" w:type="dxa"/>
@@ -6419,6 +6456,9 @@
         <w:gridCol w:w="2289"/>
       </w:tblGrid>
       <w:tr>
+        <w:trPr>
+          <w:cantSplit w:val="1"/>
+        </w:trPr>
         <w:tc>
           <w:tcPr>
             <w:tcW w:w="1400" w:type="dxa"/>
@@ -6561,6 +6601,9 @@
         </w:tc>
       </w:tr>
       <w:tr>
+        <w:trPr>
+          <w:cantSplit w:val="1"/>
+        </w:trPr>
         <w:tc>
           <w:tcPr>
             <w:tcW w:w="1400" w:type="dxa"/>
@@ -6691,6 +6734,9 @@
         </w:tc>
       </w:tr>
       <w:tr>
+        <w:trPr>
+          <w:cantSplit w:val="1"/>
+        </w:trPr>
         <w:tc>
           <w:tcPr>
             <w:tcW w:w="1400" w:type="dxa"/>
@@ -6821,6 +6867,9 @@
         </w:tc>
       </w:tr>
       <w:tr>
+        <w:trPr>
+          <w:cantSplit w:val="1"/>
+        </w:trPr>
         <w:tc>
           <w:tcPr>
             <w:tcW w:w="1400" w:type="dxa"/>
@@ -6951,6 +7000,9 @@
         </w:tc>
       </w:tr>
       <w:tr>
+        <w:trPr>
+          <w:cantSplit w:val="1"/>
+        </w:trPr>
         <w:tc>
           <w:tcPr>
             <w:tcW w:w="1400" w:type="dxa"/>
@@ -7081,6 +7133,9 @@
         </w:tc>
       </w:tr>
       <w:tr>
+        <w:trPr>
+          <w:cantSplit w:val="1"/>
+        </w:trPr>
         <w:tc>
           <w:tcPr>
             <w:tcW w:w="1400" w:type="dxa"/>
@@ -7148,6 +7203,9 @@
         </w:tc>
       </w:tr>
       <w:tr>
+        <w:trPr>
+          <w:cantSplit w:val="1"/>
+        </w:trPr>
         <w:tc>
           <w:tcPr>
             <w:tcW w:w="1400" w:type="dxa"/>
@@ -7695,6 +7753,9 @@
         <w:gridCol w:w="1729"/>
       </w:tblGrid>
       <w:tr>
+        <w:trPr>
+          <w:cantSplit w:val="1"/>
+        </w:trPr>
         <w:tc>
           <w:tcPr>
             <w:tcW w:w="2280" w:type="dxa"/>
@@ -7802,6 +7863,9 @@
         </w:tc>
       </w:tr>
       <w:tr>
+        <w:trPr>
+          <w:cantSplit w:val="1"/>
+        </w:trPr>
         <w:tc>
           <w:tcPr>
             <w:tcW w:w="2280" w:type="dxa"/>
@@ -7910,6 +7974,9 @@
         </w:tc>
       </w:tr>
       <w:tr>
+        <w:trPr>
+          <w:cantSplit w:val="1"/>
+        </w:trPr>
         <w:tc>
           <w:tcPr>
             <w:tcW w:w="2280" w:type="dxa"/>
@@ -8018,6 +8085,9 @@
         </w:tc>
       </w:tr>
       <w:tr>
+        <w:trPr>
+          <w:cantSplit w:val="1"/>
+        </w:trPr>
         <w:tc>
           <w:tcPr>
             <w:tcW w:w="2280" w:type="dxa"/>
@@ -8078,7 +8148,7 @@
                 <w:szCs w:val="18"/>
                 <w:rtl w:val="0"/>
               </w:rPr>
-              <w:t xml:space="preserve">3 co-ops · 8,000 members × €1.40 × 2 harvest seasons + 2 exporters · 200 dossiers × €45 ≈ €31k</w:t>
+              <w:t xml:space="preserve">(8,000 members × €1.40 × 2 seasons) + (200 dossiers × €45) ≈ €31k, across 3 co-ops and 2 exporters</w:t>
             </w:r>
           </w:p>
         </w:tc>
@@ -8252,7 +8322,7 @@
           <w:szCs w:val="22"/>
           <w:rtl w:val="0"/>
         </w:rPr>
-        <w:t xml:space="preserve"> We price under 5% of the value we unlock.</w:t>
+        <w:t xml:space="preserve"> We price at ≈5% of the value we unlock.</w:t>
       </w:r>
     </w:p>
     <w:p>
@@ -8874,6 +8944,9 @@
         <w:gridCol w:w="3549"/>
       </w:tblGrid>
       <w:tr>
+        <w:trPr>
+          <w:cantSplit w:val="1"/>
+        </w:trPr>
         <w:tc>
           <w:tcPr>
             <w:tcW w:w="2620" w:type="dxa"/>
@@ -8981,6 +9054,9 @@
         </w:tc>
       </w:tr>
       <w:tr>
+        <w:trPr>
+          <w:cantSplit w:val="1"/>
+        </w:trPr>
         <w:tc>
           <w:tcPr>
             <w:tcW w:w="2620" w:type="dxa"/>
@@ -9098,6 +9174,9 @@
         </w:tc>
       </w:tr>
       <w:tr>
+        <w:trPr>
+          <w:cantSplit w:val="1"/>
+        </w:trPr>
         <w:tc>
           <w:tcPr>
             <w:tcW w:w="2620" w:type="dxa"/>
@@ -9235,6 +9314,9 @@
         </w:tc>
       </w:tr>
       <w:tr>
+        <w:trPr>
+          <w:cantSplit w:val="1"/>
+        </w:trPr>
         <w:tc>
           <w:tcPr>
             <w:tcW w:w="2620" w:type="dxa"/>
@@ -9333,6 +9415,9 @@
         </w:tc>
       </w:tr>
       <w:tr>
+        <w:trPr>
+          <w:cantSplit w:val="1"/>
+        </w:trPr>
         <w:tc>
           <w:tcPr>
             <w:tcW w:w="2620" w:type="dxa"/>
@@ -9431,6 +9516,9 @@
         </w:tc>
       </w:tr>
       <w:tr>
+        <w:trPr>
+          <w:cantSplit w:val="1"/>
+        </w:trPr>
         <w:tc>
           <w:tcPr>
             <w:tcW w:w="2620" w:type="dxa"/>
@@ -9649,15 +9737,405 @@
     </w:p>
     <w:p>
       <w:pPr>
+        <w:keepNext w:val="1"/>
+        <w:spacing w:after="80" w:before="160" w:line="240" w:lineRule="auto"/>
+        <w:ind w:left="720" w:firstLine="0"/>
+        <w:rPr>
+          <w:rFonts w:ascii="Times New Roman" w:cs="Times New Roman" w:eastAsia="Times New Roman" w:hAnsi="Times New Roman"/>
+          <w:b w:val="1"/>
+          <w:sz w:val="23"/>
+          <w:szCs w:val="23"/>
+          <w:color w:val="1F3864"/>
+        </w:rPr>
+      </w:pPr>
+      <w:r>
+        <w:rPr>
+          <w:rFonts w:ascii="Times New Roman" w:cs="Times New Roman" w:eastAsia="Times New Roman" w:hAnsi="Times New Roman"/>
+          <w:b w:val="1"/>
+          <w:sz w:val="23"/>
+          <w:szCs w:val="23"/>
+          <w:color w:val="1F3864"/>
+          <w:rtl w:val="0"/>
+        </w:rPr>
+        <w:t xml:space="preserve">6.1  Data flow (the numbered steps match the chips in Figure 1, next page)</w:t>
+      </w:r>
+    </w:p>
+    <w:p>
+      <w:pPr>
+        <w:spacing w:after="46" w:before="0" w:line="276" w:lineRule="auto"/>
+        <w:ind w:left="1080" w:firstLine="0"/>
+        <w:jc w:val="left"/>
+        <w:rPr>
+          <w:rFonts w:ascii="Times New Roman" w:cs="Times New Roman" w:eastAsia="Times New Roman" w:hAnsi="Times New Roman"/>
+          <w:sz w:val="21"/>
+          <w:szCs w:val="21"/>
+        </w:rPr>
+      </w:pPr>
+      <w:r>
+        <w:rPr>
+          <w:rFonts w:ascii="Times New Roman" w:cs="Times New Roman" w:eastAsia="Times New Roman" w:hAnsi="Times New Roman"/>
+          <w:sz w:val="21"/>
+          <w:szCs w:val="21"/>
+          <w:b w:val="1"/>
+          <w:rtl w:val="0"/>
+        </w:rPr>
+        <w:t xml:space="preserve">1.</w:t>
+      </w:r>
+      <w:r>
+        <w:rPr>
+          <w:rFonts w:ascii="Times New Roman" w:cs="Times New Roman" w:eastAsia="Times New Roman" w:hAnsi="Times New Roman"/>
+          <w:sz w:val="21"/>
+          <w:szCs w:val="21"/>
+          <w:rtl w:val="0"/>
+        </w:rPr>
+        <w:t xml:space="preserve">  Field capture, fully offline: GPS point/polygon, photos, farmer identity → IndexedDB queue.</w:t>
+      </w:r>
+    </w:p>
+    <w:p>
+      <w:pPr>
+        <w:spacing w:after="46" w:before="0" w:line="276" w:lineRule="auto"/>
+        <w:ind w:left="1080" w:firstLine="0"/>
+        <w:jc w:val="left"/>
+        <w:rPr>
+          <w:rFonts w:ascii="Times New Roman" w:cs="Times New Roman" w:eastAsia="Times New Roman" w:hAnsi="Times New Roman"/>
+          <w:sz w:val="21"/>
+          <w:szCs w:val="21"/>
+        </w:rPr>
+      </w:pPr>
+      <w:r>
+        <w:rPr>
+          <w:rFonts w:ascii="Times New Roman" w:cs="Times New Roman" w:eastAsia="Times New Roman" w:hAnsi="Times New Roman"/>
+          <w:sz w:val="21"/>
+          <w:szCs w:val="21"/>
+          <w:b w:val="1"/>
+          <w:rtl w:val="0"/>
+        </w:rPr>
+        <w:t xml:space="preserve">2.</w:t>
+      </w:r>
+      <w:r>
+        <w:rPr>
+          <w:rFonts w:ascii="Times New Roman" w:cs="Times New Roman" w:eastAsia="Times New Roman" w:hAnsi="Times New Roman"/>
+          <w:sz w:val="21"/>
+          <w:szCs w:val="21"/>
+          <w:rtl w:val="0"/>
+        </w:rPr>
+        <w:t xml:space="preserve">  Sync to the API (Next.js route handlers, Zod-validated); plots land in Postgres/PostGIS,</w:t>
+      </w:r>
+      <w:r>
+        <w:rPr>
+          <w:rFonts w:ascii="Times New Roman" w:cs="Times New Roman" w:eastAsia="Times New Roman" w:hAnsi="Times New Roman"/>
+          <w:sz w:val="21"/>
+          <w:szCs w:val="21"/>
+          <w:vertAlign w:val="superscript"/>
+          <w:rtl w:val="0"/>
+        </w:rPr>
+        <w:t xml:space="preserve">39</w:t>
+      </w:r>
+      <w:r>
+        <w:rPr>
+          <w:rFonts w:ascii="Times New Roman" w:cs="Times New Roman" w:eastAsia="Times New Roman" w:hAnsi="Times New Roman"/>
+          <w:sz w:val="21"/>
+          <w:szCs w:val="21"/>
+          <w:rtl w:val="0"/>
+        </w:rPr>
+        <w:t xml:space="preserve"> where the ST_Intersects gate blocks exact-duplicate claims outright and flags partial overlaps into the risk score.</w:t>
+      </w:r>
+    </w:p>
+    <w:p>
+      <w:pPr>
+        <w:spacing w:after="46" w:before="0" w:line="276" w:lineRule="auto"/>
+        <w:ind w:left="1080" w:firstLine="0"/>
+        <w:jc w:val="left"/>
+        <w:rPr>
+          <w:rFonts w:ascii="Times New Roman" w:cs="Times New Roman" w:eastAsia="Times New Roman" w:hAnsi="Times New Roman"/>
+          <w:sz w:val="21"/>
+          <w:szCs w:val="21"/>
+        </w:rPr>
+      </w:pPr>
+      <w:r>
+        <w:rPr>
+          <w:rFonts w:ascii="Times New Roman" w:cs="Times New Roman" w:eastAsia="Times New Roman" w:hAnsi="Times New Roman"/>
+          <w:sz w:val="21"/>
+          <w:szCs w:val="21"/>
+          <w:b w:val="1"/>
+          <w:rtl w:val="0"/>
+        </w:rPr>
+        <w:t xml:space="preserve">3.</w:t>
+      </w:r>
+      <w:r>
+        <w:rPr>
+          <w:rFonts w:ascii="Times New Roman" w:cs="Times New Roman" w:eastAsia="Times New Roman" w:hAnsi="Times New Roman"/>
+          <w:sz w:val="21"/>
+          <w:szCs w:val="21"/>
+          <w:rtl w:val="0"/>
+        </w:rPr>
+        <w:t xml:space="preserve">  AI engine gathers satellite evidence (Whisp primary; GFW independent track)</w:t>
+      </w:r>
+      <w:r>
+        <w:rPr>
+          <w:rFonts w:ascii="Times New Roman" w:cs="Times New Roman" w:eastAsia="Times New Roman" w:hAnsi="Times New Roman"/>
+          <w:sz w:val="21"/>
+          <w:szCs w:val="21"/>
+          <w:vertAlign w:val="superscript"/>
+          <w:rtl w:val="0"/>
+        </w:rPr>
+        <w:t xml:space="preserve">6,7</w:t>
+      </w:r>
+      <w:r>
+        <w:rPr>
+          <w:rFonts w:ascii="Times New Roman" w:cs="Times New Roman" w:eastAsia="Times New Roman" w:hAnsi="Times New Roman"/>
+          <w:sz w:val="21"/>
+          <w:szCs w:val="21"/>
+          <w:rtl w:val="0"/>
+        </w:rPr>
+        <w:t xml:space="preserve"> and Gemini writes the Bahasa verdict.</w:t>
+      </w:r>
+      <w:r>
+        <w:rPr>
+          <w:rFonts w:ascii="Times New Roman" w:cs="Times New Roman" w:eastAsia="Times New Roman" w:hAnsi="Times New Roman"/>
+          <w:sz w:val="21"/>
+          <w:szCs w:val="21"/>
+          <w:vertAlign w:val="superscript"/>
+          <w:rtl w:val="0"/>
+        </w:rPr>
+        <w:t xml:space="preserve">31</w:t>
+      </w:r>
+    </w:p>
+    <w:p>
+      <w:pPr>
+        <w:spacing w:after="46" w:before="0" w:line="276" w:lineRule="auto"/>
+        <w:ind w:left="1080" w:firstLine="0"/>
+        <w:jc w:val="left"/>
+        <w:rPr>
+          <w:rFonts w:ascii="Times New Roman" w:cs="Times New Roman" w:eastAsia="Times New Roman" w:hAnsi="Times New Roman"/>
+          <w:sz w:val="21"/>
+          <w:szCs w:val="21"/>
+        </w:rPr>
+      </w:pPr>
+      <w:r>
+        <w:rPr>
+          <w:rFonts w:ascii="Times New Roman" w:cs="Times New Roman" w:eastAsia="Times New Roman" w:hAnsi="Times New Roman"/>
+          <w:sz w:val="21"/>
+          <w:szCs w:val="21"/>
+          <w:b w:val="1"/>
+          <w:rtl w:val="0"/>
+        </w:rPr>
+        <w:t xml:space="preserve">4.</w:t>
+      </w:r>
+      <w:r>
+        <w:rPr>
+          <w:rFonts w:ascii="Times New Roman" w:cs="Times New Roman" w:eastAsia="Times New Roman" w:hAnsi="Times New Roman"/>
+          <w:sz w:val="21"/>
+          <w:szCs w:val="21"/>
+          <w:rtl w:val="0"/>
+        </w:rPr>
+        <w:t xml:space="preserve">  Cooperative reviews the AI-annotated queue in its Console.</w:t>
+      </w:r>
+    </w:p>
+    <w:p>
+      <w:pPr>
+        <w:spacing w:after="46" w:before="0" w:line="276" w:lineRule="auto"/>
+        <w:ind w:left="1080" w:firstLine="0"/>
+        <w:jc w:val="left"/>
+        <w:rPr>
+          <w:rFonts w:ascii="Times New Roman" w:cs="Times New Roman" w:eastAsia="Times New Roman" w:hAnsi="Times New Roman"/>
+          <w:sz w:val="21"/>
+          <w:szCs w:val="21"/>
+        </w:rPr>
+      </w:pPr>
+      <w:r>
+        <w:rPr>
+          <w:rFonts w:ascii="Times New Roman" w:cs="Times New Roman" w:eastAsia="Times New Roman" w:hAnsi="Times New Roman"/>
+          <w:sz w:val="21"/>
+          <w:szCs w:val="21"/>
+          <w:b w:val="1"/>
+          <w:rtl w:val="0"/>
+        </w:rPr>
+        <w:t xml:space="preserve">5.</w:t>
+      </w:r>
+      <w:r>
+        <w:rPr>
+          <w:rFonts w:ascii="Times New Roman" w:cs="Times New Roman" w:eastAsia="Times New Roman" w:hAnsi="Times New Roman"/>
+          <w:sz w:val="21"/>
+          <w:szCs w:val="21"/>
+          <w:rtl w:val="0"/>
+        </w:rPr>
+        <w:t xml:space="preserve">  Approved bundle → W3C Verifiable Credential 2.0, signed with the cooperative’s did:key (Ed25519).</w:t>
+      </w:r>
+      <w:r>
+        <w:rPr>
+          <w:rFonts w:ascii="Times New Roman" w:cs="Times New Roman" w:eastAsia="Times New Roman" w:hAnsi="Times New Roman"/>
+          <w:sz w:val="21"/>
+          <w:szCs w:val="21"/>
+          <w:vertAlign w:val="superscript"/>
+          <w:rtl w:val="0"/>
+        </w:rPr>
+        <w:t xml:space="preserve">8</w:t>
+      </w:r>
+    </w:p>
+    <w:p>
+      <w:pPr>
+        <w:spacing w:after="46" w:before="0" w:line="276" w:lineRule="auto"/>
+        <w:ind w:left="1080" w:firstLine="0"/>
+        <w:jc w:val="left"/>
+        <w:rPr>
+          <w:rFonts w:ascii="Times New Roman" w:cs="Times New Roman" w:eastAsia="Times New Roman" w:hAnsi="Times New Roman"/>
+          <w:sz w:val="21"/>
+          <w:szCs w:val="21"/>
+        </w:rPr>
+      </w:pPr>
+      <w:r>
+        <w:rPr>
+          <w:rFonts w:ascii="Times New Roman" w:cs="Times New Roman" w:eastAsia="Times New Roman" w:hAnsi="Times New Roman"/>
+          <w:sz w:val="21"/>
+          <w:szCs w:val="21"/>
+          <w:b w:val="1"/>
+          <w:rtl w:val="0"/>
+        </w:rPr>
+        <w:t xml:space="preserve">6.</w:t>
+      </w:r>
+      <w:r>
+        <w:rPr>
+          <w:rFonts w:ascii="Times New Roman" w:cs="Times New Roman" w:eastAsia="Times New Roman" w:hAnsi="Times New Roman"/>
+          <w:sz w:val="21"/>
+          <w:szCs w:val="21"/>
+          <w:rtl w:val="0"/>
+        </w:rPr>
+        <w:t xml:space="preserve">  Bundle hashes batch into a Merkle tree — thousands of plots, one 32-byte root.</w:t>
+      </w:r>
+    </w:p>
+    <w:p>
+      <w:pPr>
+        <w:spacing w:after="46" w:before="0" w:line="276" w:lineRule="auto"/>
+        <w:ind w:left="1080" w:firstLine="0"/>
+        <w:jc w:val="left"/>
+        <w:rPr>
+          <w:rFonts w:ascii="Times New Roman" w:cs="Times New Roman" w:eastAsia="Times New Roman" w:hAnsi="Times New Roman"/>
+          <w:sz w:val="21"/>
+          <w:szCs w:val="21"/>
+        </w:rPr>
+      </w:pPr>
+      <w:r>
+        <w:rPr>
+          <w:rFonts w:ascii="Times New Roman" w:cs="Times New Roman" w:eastAsia="Times New Roman" w:hAnsi="Times New Roman"/>
+          <w:sz w:val="21"/>
+          <w:szCs w:val="21"/>
+          <w:b w:val="1"/>
+          <w:rtl w:val="0"/>
+        </w:rPr>
+        <w:t xml:space="preserve">7.</w:t>
+      </w:r>
+      <w:r>
+        <w:rPr>
+          <w:rFonts w:ascii="Times New Roman" w:cs="Times New Roman" w:eastAsia="Times New Roman" w:hAnsi="Times New Roman"/>
+          <w:sz w:val="21"/>
+          <w:szCs w:val="21"/>
+          <w:rtl w:val="0"/>
+        </w:rPr>
+        <w:t xml:space="preserve">  The root is anchored by TandaRegistry.sol on Polygon; the event is public forever.</w:t>
+      </w:r>
+      <w:r>
+        <w:rPr>
+          <w:rFonts w:ascii="Times New Roman" w:cs="Times New Roman" w:eastAsia="Times New Roman" w:hAnsi="Times New Roman"/>
+          <w:sz w:val="21"/>
+          <w:szCs w:val="21"/>
+          <w:vertAlign w:val="superscript"/>
+          <w:rtl w:val="0"/>
+        </w:rPr>
+        <w:t xml:space="preserve">9</w:t>
+      </w:r>
+    </w:p>
+    <w:p>
+      <w:pPr>
+        <w:spacing w:after="46" w:before="0" w:line="276" w:lineRule="auto"/>
+        <w:ind w:left="1080" w:firstLine="0"/>
+        <w:jc w:val="left"/>
+        <w:rPr>
+          <w:rFonts w:ascii="Times New Roman" w:cs="Times New Roman" w:eastAsia="Times New Roman" w:hAnsi="Times New Roman"/>
+          <w:sz w:val="21"/>
+          <w:szCs w:val="21"/>
+        </w:rPr>
+      </w:pPr>
+      <w:r>
+        <w:rPr>
+          <w:rFonts w:ascii="Times New Roman" w:cs="Times New Roman" w:eastAsia="Times New Roman" w:hAnsi="Times New Roman"/>
+          <w:sz w:val="21"/>
+          <w:szCs w:val="21"/>
+          <w:b w:val="1"/>
+          <w:rtl w:val="0"/>
+        </w:rPr>
+        <w:t xml:space="preserve">8.</w:t>
+      </w:r>
+      <w:r>
+        <w:rPr>
+          <w:rFonts w:ascii="Times New Roman" w:cs="Times New Roman" w:eastAsia="Times New Roman" w:hAnsi="Times New Roman"/>
+          <w:sz w:val="21"/>
+          <w:szCs w:val="21"/>
+          <w:rtl w:val="0"/>
+        </w:rPr>
+        <w:t xml:space="preserve">  Exporter composes verified passports → TRACES GeoJSON + evidence-PDF dossier.</w:t>
+      </w:r>
+      <w:r>
+        <w:rPr>
+          <w:rFonts w:ascii="Times New Roman" w:cs="Times New Roman" w:eastAsia="Times New Roman" w:hAnsi="Times New Roman"/>
+          <w:sz w:val="21"/>
+          <w:szCs w:val="21"/>
+          <w:vertAlign w:val="superscript"/>
+          <w:rtl w:val="0"/>
+        </w:rPr>
+        <w:t xml:space="preserve">10</w:t>
+      </w:r>
+    </w:p>
+    <w:p>
+      <w:pPr>
+        <w:spacing w:after="46" w:before="0" w:line="276" w:lineRule="auto"/>
+        <w:ind w:left="1080" w:firstLine="0"/>
+        <w:jc w:val="left"/>
+        <w:rPr>
+          <w:rFonts w:ascii="Times New Roman" w:cs="Times New Roman" w:eastAsia="Times New Roman" w:hAnsi="Times New Roman"/>
+          <w:sz w:val="21"/>
+          <w:szCs w:val="21"/>
+        </w:rPr>
+      </w:pPr>
+      <w:r>
+        <w:rPr>
+          <w:rFonts w:ascii="Times New Roman" w:cs="Times New Roman" w:eastAsia="Times New Roman" w:hAnsi="Times New Roman"/>
+          <w:sz w:val="21"/>
+          <w:szCs w:val="21"/>
+          <w:b w:val="1"/>
+          <w:rtl w:val="0"/>
+        </w:rPr>
+        <w:t xml:space="preserve">9.</w:t>
+      </w:r>
+      <w:r>
+        <w:rPr>
+          <w:rFonts w:ascii="Times New Roman" w:cs="Times New Roman" w:eastAsia="Times New Roman" w:hAnsi="Times New Roman"/>
+          <w:sz w:val="21"/>
+          <w:szCs w:val="21"/>
+          <w:rtl w:val="0"/>
+        </w:rPr>
+        <w:t xml:space="preserve">  Anyone scans the QR: the browser re-computes the hash and checks VC signature + Merkle proof against the chain.</w:t>
+      </w:r>
+    </w:p>
+    <w:p>
+      <w:pPr>
+        <w:spacing w:after="0"/>
+      </w:pPr>
+      <w:r>
+        <w:br w:type="page"/>
+      </w:r>
+    </w:p>
+    <w:p>
+      <w:pPr>
         <w:spacing w:after="120" w:before="60" w:line="240" w:lineRule="auto"/>
-        <w:ind w:left="0" w:firstLine="0"/>
+        <w:ind w:left="800" w:firstLine="0"/>
         <w:jc w:val="center"/>
       </w:pPr>
       <w:r>
         <w:rPr/>
         <w:drawing>
           <wp:inline distT="0" distB="0" distL="0" distR="0">
-            <wp:extent cx="5733415" cy="3555376"/>
+            <wp:extent cx="4718050" cy="7608347"/>
             <wp:effectExtent b="0" l="0" r="0" t="0"/>
             <wp:docPr id="9001" name="image_akar_1.png"/>
             <a:graphic xmlns:a="http://schemas.openxmlformats.org/drawingml/2006/main">
@@ -9676,7 +10154,7 @@
                   <pic:spPr>
                     <a:xfrm>
                       <a:off x="0" y="0"/>
-                      <a:ext cx="5733415" cy="3555376"/>
+                      <a:ext cx="4718050" cy="7608347"/>
                     </a:xfrm>
                     <a:prstGeom prst="rect">
                       <a:avLst/>
@@ -9709,389 +10187,7 @@
           <w:color w:val="666666"/>
           <w:rtl w:val="0"/>
         </w:rPr>
-        <w:t xml:space="preserve">Figure 1 — TandaTani system architecture and data flow. Numbered chips on the arrows match the data-flow steps in §6.1.</w:t>
-      </w:r>
-    </w:p>
-    <w:p>
-      <w:pPr>
-        <w:keepNext w:val="1"/>
-        <w:spacing w:after="80" w:before="160" w:line="240" w:lineRule="auto"/>
-        <w:ind w:left="720" w:firstLine="0"/>
-        <w:rPr>
-          <w:rFonts w:ascii="Times New Roman" w:cs="Times New Roman" w:eastAsia="Times New Roman" w:hAnsi="Times New Roman"/>
-          <w:b w:val="1"/>
-          <w:sz w:val="23"/>
-          <w:szCs w:val="23"/>
-          <w:color w:val="1F3864"/>
-        </w:rPr>
-      </w:pPr>
-      <w:r>
-        <w:rPr>
-          <w:rFonts w:ascii="Times New Roman" w:cs="Times New Roman" w:eastAsia="Times New Roman" w:hAnsi="Times New Roman"/>
-          <w:b w:val="1"/>
-          <w:sz w:val="23"/>
-          <w:szCs w:val="23"/>
-          <w:color w:val="1F3864"/>
-          <w:rtl w:val="0"/>
-        </w:rPr>
-        <w:t xml:space="preserve">6.1  Data flow (follows the diagram’s numbering)</w:t>
-      </w:r>
-    </w:p>
-    <w:p>
-      <w:pPr>
-        <w:spacing w:after="46" w:before="0" w:line="276" w:lineRule="auto"/>
-        <w:ind w:left="1080" w:firstLine="0"/>
-        <w:jc w:val="left"/>
-        <w:rPr>
-          <w:rFonts w:ascii="Times New Roman" w:cs="Times New Roman" w:eastAsia="Times New Roman" w:hAnsi="Times New Roman"/>
-          <w:sz w:val="21"/>
-          <w:szCs w:val="21"/>
-        </w:rPr>
-      </w:pPr>
-      <w:r>
-        <w:rPr>
-          <w:rFonts w:ascii="Times New Roman" w:cs="Times New Roman" w:eastAsia="Times New Roman" w:hAnsi="Times New Roman"/>
-          <w:sz w:val="21"/>
-          <w:szCs w:val="21"/>
-          <w:b w:val="1"/>
-          <w:rtl w:val="0"/>
-        </w:rPr>
-        <w:t xml:space="preserve">1.</w:t>
-      </w:r>
-      <w:r>
-        <w:rPr>
-          <w:rFonts w:ascii="Times New Roman" w:cs="Times New Roman" w:eastAsia="Times New Roman" w:hAnsi="Times New Roman"/>
-          <w:sz w:val="21"/>
-          <w:szCs w:val="21"/>
-          <w:rtl w:val="0"/>
-        </w:rPr>
-        <w:t xml:space="preserve">  Field capture, fully offline: GPS point/polygon, photos, farmer identity → IndexedDB queue.</w:t>
-      </w:r>
-    </w:p>
-    <w:p>
-      <w:pPr>
-        <w:spacing w:after="46" w:before="0" w:line="276" w:lineRule="auto"/>
-        <w:ind w:left="1080" w:firstLine="0"/>
-        <w:jc w:val="left"/>
-        <w:rPr>
-          <w:rFonts w:ascii="Times New Roman" w:cs="Times New Roman" w:eastAsia="Times New Roman" w:hAnsi="Times New Roman"/>
-          <w:sz w:val="21"/>
-          <w:szCs w:val="21"/>
-        </w:rPr>
-      </w:pPr>
-      <w:r>
-        <w:rPr>
-          <w:rFonts w:ascii="Times New Roman" w:cs="Times New Roman" w:eastAsia="Times New Roman" w:hAnsi="Times New Roman"/>
-          <w:sz w:val="21"/>
-          <w:szCs w:val="21"/>
-          <w:b w:val="1"/>
-          <w:rtl w:val="0"/>
-        </w:rPr>
-        <w:t xml:space="preserve">2.</w:t>
-      </w:r>
-      <w:r>
-        <w:rPr>
-          <w:rFonts w:ascii="Times New Roman" w:cs="Times New Roman" w:eastAsia="Times New Roman" w:hAnsi="Times New Roman"/>
-          <w:sz w:val="21"/>
-          <w:szCs w:val="21"/>
-          <w:rtl w:val="0"/>
-        </w:rPr>
-        <w:t xml:space="preserve">  Sync to the API (Next.js route handlers, Zod-validated); plots land in Postgres/PostGIS,</w:t>
-      </w:r>
-      <w:r>
-        <w:rPr>
-          <w:rFonts w:ascii="Times New Roman" w:cs="Times New Roman" w:eastAsia="Times New Roman" w:hAnsi="Times New Roman"/>
-          <w:sz w:val="21"/>
-          <w:szCs w:val="21"/>
-          <w:vertAlign w:val="superscript"/>
-          <w:rtl w:val="0"/>
-        </w:rPr>
-        <w:t xml:space="preserve">39</w:t>
-      </w:r>
-      <w:r>
-        <w:rPr>
-          <w:rFonts w:ascii="Times New Roman" w:cs="Times New Roman" w:eastAsia="Times New Roman" w:hAnsi="Times New Roman"/>
-          <w:sz w:val="21"/>
-          <w:szCs w:val="21"/>
-          <w:rtl w:val="0"/>
-        </w:rPr>
-        <w:t xml:space="preserve"> where the ST_Intersects integrity gate rejects duplicate and overlapping claims on arrival.</w:t>
-      </w:r>
-    </w:p>
-    <w:p>
-      <w:pPr>
-        <w:spacing w:after="46" w:before="0" w:line="276" w:lineRule="auto"/>
-        <w:ind w:left="1080" w:firstLine="0"/>
-        <w:jc w:val="left"/>
-        <w:rPr>
-          <w:rFonts w:ascii="Times New Roman" w:cs="Times New Roman" w:eastAsia="Times New Roman" w:hAnsi="Times New Roman"/>
-          <w:sz w:val="21"/>
-          <w:szCs w:val="21"/>
-        </w:rPr>
-      </w:pPr>
-      <w:r>
-        <w:rPr>
-          <w:rFonts w:ascii="Times New Roman" w:cs="Times New Roman" w:eastAsia="Times New Roman" w:hAnsi="Times New Roman"/>
-          <w:sz w:val="21"/>
-          <w:szCs w:val="21"/>
-          <w:b w:val="1"/>
-          <w:rtl w:val="0"/>
-        </w:rPr>
-        <w:t xml:space="preserve">3.</w:t>
-      </w:r>
-      <w:r>
-        <w:rPr>
-          <w:rFonts w:ascii="Times New Roman" w:cs="Times New Roman" w:eastAsia="Times New Roman" w:hAnsi="Times New Roman"/>
-          <w:sz w:val="21"/>
-          <w:szCs w:val="21"/>
-          <w:rtl w:val="0"/>
-        </w:rPr>
-        <w:t xml:space="preserve">  AI engine gathers satellite evidence (Whisp primary; GFW independent track)</w:t>
-      </w:r>
-      <w:r>
-        <w:rPr>
-          <w:rFonts w:ascii="Times New Roman" w:cs="Times New Roman" w:eastAsia="Times New Roman" w:hAnsi="Times New Roman"/>
-          <w:sz w:val="21"/>
-          <w:szCs w:val="21"/>
-          <w:vertAlign w:val="superscript"/>
-          <w:rtl w:val="0"/>
-        </w:rPr>
-        <w:t xml:space="preserve">6,7</w:t>
-      </w:r>
-      <w:r>
-        <w:rPr>
-          <w:rFonts w:ascii="Times New Roman" w:cs="Times New Roman" w:eastAsia="Times New Roman" w:hAnsi="Times New Roman"/>
-          <w:sz w:val="21"/>
-          <w:szCs w:val="21"/>
-          <w:rtl w:val="0"/>
-        </w:rPr>
-        <w:t xml:space="preserve"> and Gemini writes the Bahasa verdict.</w:t>
-      </w:r>
-      <w:r>
-        <w:rPr>
-          <w:rFonts w:ascii="Times New Roman" w:cs="Times New Roman" w:eastAsia="Times New Roman" w:hAnsi="Times New Roman"/>
-          <w:sz w:val="21"/>
-          <w:szCs w:val="21"/>
-          <w:vertAlign w:val="superscript"/>
-          <w:rtl w:val="0"/>
-        </w:rPr>
-        <w:t xml:space="preserve">31</w:t>
-      </w:r>
-    </w:p>
-    <w:p>
-      <w:pPr>
-        <w:spacing w:after="46" w:before="0" w:line="276" w:lineRule="auto"/>
-        <w:ind w:left="1080" w:firstLine="0"/>
-        <w:jc w:val="left"/>
-        <w:rPr>
-          <w:rFonts w:ascii="Times New Roman" w:cs="Times New Roman" w:eastAsia="Times New Roman" w:hAnsi="Times New Roman"/>
-          <w:sz w:val="21"/>
-          <w:szCs w:val="21"/>
-        </w:rPr>
-      </w:pPr>
-      <w:r>
-        <w:rPr>
-          <w:rFonts w:ascii="Times New Roman" w:cs="Times New Roman" w:eastAsia="Times New Roman" w:hAnsi="Times New Roman"/>
-          <w:sz w:val="21"/>
-          <w:szCs w:val="21"/>
-          <w:b w:val="1"/>
-          <w:rtl w:val="0"/>
-        </w:rPr>
-        <w:t xml:space="preserve">4.</w:t>
-      </w:r>
-      <w:r>
-        <w:rPr>
-          <w:rFonts w:ascii="Times New Roman" w:cs="Times New Roman" w:eastAsia="Times New Roman" w:hAnsi="Times New Roman"/>
-          <w:sz w:val="21"/>
-          <w:szCs w:val="21"/>
-          <w:rtl w:val="0"/>
-        </w:rPr>
-        <w:t xml:space="preserve">  Cooperative reviews the AI-annotated queue in its Console.</w:t>
-      </w:r>
-    </w:p>
-    <w:p>
-      <w:pPr>
-        <w:spacing w:after="46" w:before="0" w:line="276" w:lineRule="auto"/>
-        <w:ind w:left="1080" w:firstLine="0"/>
-        <w:jc w:val="left"/>
-        <w:rPr>
-          <w:rFonts w:ascii="Times New Roman" w:cs="Times New Roman" w:eastAsia="Times New Roman" w:hAnsi="Times New Roman"/>
-          <w:sz w:val="21"/>
-          <w:szCs w:val="21"/>
-        </w:rPr>
-      </w:pPr>
-      <w:r>
-        <w:rPr>
-          <w:rFonts w:ascii="Times New Roman" w:cs="Times New Roman" w:eastAsia="Times New Roman" w:hAnsi="Times New Roman"/>
-          <w:sz w:val="21"/>
-          <w:szCs w:val="21"/>
-          <w:b w:val="1"/>
-          <w:rtl w:val="0"/>
-        </w:rPr>
-        <w:t xml:space="preserve">5.</w:t>
-      </w:r>
-      <w:r>
-        <w:rPr>
-          <w:rFonts w:ascii="Times New Roman" w:cs="Times New Roman" w:eastAsia="Times New Roman" w:hAnsi="Times New Roman"/>
-          <w:sz w:val="21"/>
-          <w:szCs w:val="21"/>
-          <w:rtl w:val="0"/>
-        </w:rPr>
-        <w:t xml:space="preserve">  Approved bundle → W3C Verifiable Credential 2.0, signed with the cooperative’s did:key (Ed25519).</w:t>
-      </w:r>
-      <w:r>
-        <w:rPr>
-          <w:rFonts w:ascii="Times New Roman" w:cs="Times New Roman" w:eastAsia="Times New Roman" w:hAnsi="Times New Roman"/>
-          <w:sz w:val="21"/>
-          <w:szCs w:val="21"/>
-          <w:vertAlign w:val="superscript"/>
-          <w:rtl w:val="0"/>
-        </w:rPr>
-        <w:t xml:space="preserve">8</w:t>
-      </w:r>
-    </w:p>
-    <w:p>
-      <w:pPr>
-        <w:spacing w:after="46" w:before="0" w:line="276" w:lineRule="auto"/>
-        <w:ind w:left="1080" w:firstLine="0"/>
-        <w:jc w:val="left"/>
-        <w:rPr>
-          <w:rFonts w:ascii="Times New Roman" w:cs="Times New Roman" w:eastAsia="Times New Roman" w:hAnsi="Times New Roman"/>
-          <w:sz w:val="21"/>
-          <w:szCs w:val="21"/>
-        </w:rPr>
-      </w:pPr>
-      <w:r>
-        <w:rPr>
-          <w:rFonts w:ascii="Times New Roman" w:cs="Times New Roman" w:eastAsia="Times New Roman" w:hAnsi="Times New Roman"/>
-          <w:sz w:val="21"/>
-          <w:szCs w:val="21"/>
-          <w:b w:val="1"/>
-          <w:rtl w:val="0"/>
-        </w:rPr>
-        <w:t xml:space="preserve">6.</w:t>
-      </w:r>
-      <w:r>
-        <w:rPr>
-          <w:rFonts w:ascii="Times New Roman" w:cs="Times New Roman" w:eastAsia="Times New Roman" w:hAnsi="Times New Roman"/>
-          <w:sz w:val="21"/>
-          <w:szCs w:val="21"/>
-          <w:rtl w:val="0"/>
-        </w:rPr>
-        <w:t xml:space="preserve">  Bundle hashes batch into a Merkle tree — thousands of plots, one 32-byte root.</w:t>
-      </w:r>
-    </w:p>
-    <w:p>
-      <w:pPr>
-        <w:spacing w:after="46" w:before="0" w:line="276" w:lineRule="auto"/>
-        <w:ind w:left="1080" w:firstLine="0"/>
-        <w:jc w:val="left"/>
-        <w:rPr>
-          <w:rFonts w:ascii="Times New Roman" w:cs="Times New Roman" w:eastAsia="Times New Roman" w:hAnsi="Times New Roman"/>
-          <w:sz w:val="21"/>
-          <w:szCs w:val="21"/>
-        </w:rPr>
-      </w:pPr>
-      <w:r>
-        <w:rPr>
-          <w:rFonts w:ascii="Times New Roman" w:cs="Times New Roman" w:eastAsia="Times New Roman" w:hAnsi="Times New Roman"/>
-          <w:sz w:val="21"/>
-          <w:szCs w:val="21"/>
-          <w:b w:val="1"/>
-          <w:rtl w:val="0"/>
-        </w:rPr>
-        <w:t xml:space="preserve">7.</w:t>
-      </w:r>
-      <w:r>
-        <w:rPr>
-          <w:rFonts w:ascii="Times New Roman" w:cs="Times New Roman" w:eastAsia="Times New Roman" w:hAnsi="Times New Roman"/>
-          <w:sz w:val="21"/>
-          <w:szCs w:val="21"/>
-          <w:rtl w:val="0"/>
-        </w:rPr>
-        <w:t xml:space="preserve">  The root is anchored by TandaRegistry.sol on Polygon; the event is public forever.</w:t>
-      </w:r>
-      <w:r>
-        <w:rPr>
-          <w:rFonts w:ascii="Times New Roman" w:cs="Times New Roman" w:eastAsia="Times New Roman" w:hAnsi="Times New Roman"/>
-          <w:sz w:val="21"/>
-          <w:szCs w:val="21"/>
-          <w:vertAlign w:val="superscript"/>
-          <w:rtl w:val="0"/>
-        </w:rPr>
-        <w:t xml:space="preserve">9</w:t>
-      </w:r>
-    </w:p>
-    <w:p>
-      <w:pPr>
-        <w:spacing w:after="46" w:before="0" w:line="276" w:lineRule="auto"/>
-        <w:ind w:left="1080" w:firstLine="0"/>
-        <w:jc w:val="left"/>
-        <w:rPr>
-          <w:rFonts w:ascii="Times New Roman" w:cs="Times New Roman" w:eastAsia="Times New Roman" w:hAnsi="Times New Roman"/>
-          <w:sz w:val="21"/>
-          <w:szCs w:val="21"/>
-        </w:rPr>
-      </w:pPr>
-      <w:r>
-        <w:rPr>
-          <w:rFonts w:ascii="Times New Roman" w:cs="Times New Roman" w:eastAsia="Times New Roman" w:hAnsi="Times New Roman"/>
-          <w:sz w:val="21"/>
-          <w:szCs w:val="21"/>
-          <w:b w:val="1"/>
-          <w:rtl w:val="0"/>
-        </w:rPr>
-        <w:t xml:space="preserve">8.</w:t>
-      </w:r>
-      <w:r>
-        <w:rPr>
-          <w:rFonts w:ascii="Times New Roman" w:cs="Times New Roman" w:eastAsia="Times New Roman" w:hAnsi="Times New Roman"/>
-          <w:sz w:val="21"/>
-          <w:szCs w:val="21"/>
-          <w:rtl w:val="0"/>
-        </w:rPr>
-        <w:t xml:space="preserve">  Exporter composes verified passports → TRACES GeoJSON + evidence-PDF dossier.</w:t>
-      </w:r>
-      <w:r>
-        <w:rPr>
-          <w:rFonts w:ascii="Times New Roman" w:cs="Times New Roman" w:eastAsia="Times New Roman" w:hAnsi="Times New Roman"/>
-          <w:sz w:val="21"/>
-          <w:szCs w:val="21"/>
-          <w:vertAlign w:val="superscript"/>
-          <w:rtl w:val="0"/>
-        </w:rPr>
-        <w:t xml:space="preserve">10</w:t>
-      </w:r>
-    </w:p>
-    <w:p>
-      <w:pPr>
-        <w:spacing w:after="46" w:before="0" w:line="276" w:lineRule="auto"/>
-        <w:ind w:left="1080" w:firstLine="0"/>
-        <w:jc w:val="left"/>
-        <w:rPr>
-          <w:rFonts w:ascii="Times New Roman" w:cs="Times New Roman" w:eastAsia="Times New Roman" w:hAnsi="Times New Roman"/>
-          <w:sz w:val="21"/>
-          <w:szCs w:val="21"/>
-        </w:rPr>
-      </w:pPr>
-      <w:r>
-        <w:rPr>
-          <w:rFonts w:ascii="Times New Roman" w:cs="Times New Roman" w:eastAsia="Times New Roman" w:hAnsi="Times New Roman"/>
-          <w:sz w:val="21"/>
-          <w:szCs w:val="21"/>
-          <w:b w:val="1"/>
-          <w:rtl w:val="0"/>
-        </w:rPr>
-        <w:t xml:space="preserve">9.</w:t>
-      </w:r>
-      <w:r>
-        <w:rPr>
-          <w:rFonts w:ascii="Times New Roman" w:cs="Times New Roman" w:eastAsia="Times New Roman" w:hAnsi="Times New Roman"/>
-          <w:sz w:val="21"/>
-          <w:szCs w:val="21"/>
-          <w:rtl w:val="0"/>
-        </w:rPr>
-        <w:t xml:space="preserve">  Anyone scans the QR: the browser re-computes the hash and checks VC signature + Merkle proof against the chain.</w:t>
+        <w:t xml:space="preserve">Figure 1 — TandaTani system architecture and data flow (rotate to read). Numbered chips on the arrows match the data-flow steps in §6.1.</w:t>
       </w:r>
     </w:p>
     <w:p>
@@ -10148,6 +10244,9 @@
         <w:gridCol w:w="3459"/>
       </w:tblGrid>
       <w:tr>
+        <w:trPr>
+          <w:cantSplit w:val="1"/>
+        </w:trPr>
         <w:tc>
           <w:tcPr>
             <w:tcW w:w="1150" w:type="dxa"/>
@@ -10255,6 +10354,9 @@
         </w:tc>
       </w:tr>
       <w:tr>
+        <w:trPr>
+          <w:cantSplit w:val="1"/>
+        </w:trPr>
         <w:tc>
           <w:tcPr>
             <w:tcW w:w="1150" w:type="dxa"/>
@@ -10353,6 +10455,9 @@
         </w:tc>
       </w:tr>
       <w:tr>
+        <w:trPr>
+          <w:cantSplit w:val="1"/>
+        </w:trPr>
         <w:tc>
           <w:tcPr>
             <w:tcW w:w="1150" w:type="dxa"/>
@@ -10461,6 +10566,9 @@
         </w:tc>
       </w:tr>
       <w:tr>
+        <w:trPr>
+          <w:cantSplit w:val="1"/>
+        </w:trPr>
         <w:tc>
           <w:tcPr>
             <w:tcW w:w="1150" w:type="dxa"/>
@@ -10569,6 +10677,9 @@
         </w:tc>
       </w:tr>
       <w:tr>
+        <w:trPr>
+          <w:cantSplit w:val="1"/>
+        </w:trPr>
         <w:tc>
           <w:tcPr>
             <w:tcW w:w="1150" w:type="dxa"/>
@@ -10677,6 +10788,9 @@
         </w:tc>
       </w:tr>
       <w:tr>
+        <w:trPr>
+          <w:cantSplit w:val="1"/>
+        </w:trPr>
         <w:tc>
           <w:tcPr>
             <w:tcW w:w="1150" w:type="dxa"/>

</xml_diff>